<commit_message>
New plots (eg, fig s9)
</commit_message>
<xml_diff>
--- a/output/Table_S3b_rarity_wilcoxon.docx
+++ b/output/Table_S3b_rarity_wilcoxon.docx
@@ -7,7 +7,7 @@
         <w:pStyle w:val="Titre1"/>
       </w:pPr>
       <w:r>
-        <w:t xml:space="preserve">Table S3b: Wilcoxon tests - rarity group comparisons</w:t>
+        <w:t xml:space="preserve">Table S3b: Paired Wilcoxon signed-rank tests - rarity group comparisons</w:t>
       </w:r>
     </w:p>
     <w:tbl xmlns:a="http://schemas.openxmlformats.org/drawingml/2006/main" xmlns:pic="http://schemas.openxmlformats.org/drawingml/2006/picture">
@@ -24,6 +24,7 @@
         <w:gridCol w:w="1080"/>
         <w:gridCol w:w="1080"/>
         <w:gridCol w:w="1080"/>
+        <w:gridCol w:w="1080"/>
       </w:tblGrid>
       <w:tr>
         <w:trPr>
@@ -301,7 +302,7 @@
                 <w:szCs w:val="22"/>
                 <w:color w:val="000000"/>
               </w:rPr>
-              <w:t xml:space="preserve">W_statistic</w:t>
+              <w:t xml:space="preserve">n_pairs</w:t>
             </w:r>
           </w:p>
         </w:tc>
@@ -326,6 +327,61 @@
             <w:pPr>
               <w:pStyle w:val="Normal"/>
               <w:jc w:val="right"/>
+              <w:pBdr>
+                <w:bottom w:val="none" w:sz="0" w:space="0" w:color="000000"/>
+                <w:top w:val="none" w:sz="0" w:space="0" w:color="000000"/>
+                <w:left w:val="none" w:sz="0" w:space="0" w:color="000000"/>
+                <w:right w:val="none" w:sz="0" w:space="0" w:color="000000"/>
+              </w:pBdr>
+              <w:spacing w:after="100" w:before="100" w:line="240"/>
+              <w:ind w:left="100" w:right="100" w:firstLine="0" w:firstLineChars="0"/>
+              <w:rPr>
+                <w:rFonts w:ascii="Helvetica" w:hAnsi="Helvetica" w:eastAsia="Helvetica" w:cs="Helvetica"/>
+                <w:i w:val="false"/>
+                <w:b w:val="false"/>
+                <w:u w:val="none"/>
+                <w:strike w:val="false"/>
+                <w:sz w:val="22"/>
+                <w:szCs w:val="22"/>
+                <w:color w:val="000000"/>
+              </w:rPr>
+            </w:pPr>
+            <w:r>
+              <w:rPr>
+                <w:rFonts w:ascii="Helvetica" w:hAnsi="Helvetica" w:eastAsia="Helvetica" w:cs="Helvetica"/>
+                <w:i w:val="false"/>
+                <w:b w:val="false"/>
+                <w:u w:val="none"/>
+                <w:strike w:val="false"/>
+                <w:sz w:val="22"/>
+                <w:szCs w:val="22"/>
+                <w:color w:val="000000"/>
+              </w:rPr>
+              <w:t xml:space="preserve">V_statistic</w:t>
+            </w:r>
+          </w:p>
+        </w:tc>
+        <w:tc>
+          <w:tcPr>
+            <w:tcBorders>
+              <w:bottom w:val="single" w:sz="12" w:space="0" w:color="666666"/>
+              <w:top w:val="single" w:sz="12" w:space="0" w:color="666666"/>
+              <w:left w:val="none" w:sz="0" w:space="0" w:color="000000"/>
+              <w:right w:val="none" w:sz="0" w:space="0" w:color="000000"/>
+            </w:tcBorders>
+            <w:shd w:val="clear" w:color="auto" w:fill="FFFFFF"/>
+            <w:tcMar>
+              <w:top w:w="0" w:type="dxa"/>
+              <w:bottom w:w="0" w:type="dxa"/>
+              <w:left w:w="0" w:type="dxa"/>
+              <w:right w:w="0" w:type="dxa"/>
+            </w:tcMar>
+            <w:vAlign w:val="center"/>
+          </w:tcPr>
+          <w:p>
+            <w:pPr>
+              <w:pStyle w:val="Normal"/>
+              <w:jc w:val="left"/>
               <w:pBdr>
                 <w:bottom w:val="none" w:sz="0" w:space="0" w:color="000000"/>
                 <w:top w:val="none" w:sz="0" w:space="0" w:color="000000"/>
@@ -691,7 +747,7 @@
                 <w:szCs w:val="22"/>
                 <w:color w:val="000000"/>
               </w:rPr>
-              <w:t xml:space="preserve">531.0</w:t>
+              <w:t xml:space="preserve">28</w:t>
             </w:r>
           </w:p>
         </w:tc>
@@ -746,7 +802,7 @@
                 <w:szCs w:val="22"/>
                 <w:color w:val="000000"/>
               </w:rPr>
-              <w:t xml:space="preserve">0.0232</w:t>
+              <w:t xml:space="preserve">406</w:t>
             </w:r>
           </w:p>
         </w:tc>
@@ -801,7 +857,62 @@
                 <w:szCs w:val="22"/>
                 <w:color w:val="000000"/>
               </w:rPr>
-              <w:t xml:space="preserve">*</w:t>
+              <w:t xml:space="preserve">&lt;0.001</w:t>
+            </w:r>
+          </w:p>
+        </w:tc>
+        <w:tc>
+          <w:tcPr>
+            <w:tcBorders>
+              <w:bottom w:val="none" w:sz="0" w:space="0" w:color="000000"/>
+              <w:top w:val="single" w:sz="12" w:space="0" w:color="666666"/>
+              <w:left w:val="none" w:sz="0" w:space="0" w:color="000000"/>
+              <w:right w:val="none" w:sz="0" w:space="0" w:color="000000"/>
+            </w:tcBorders>
+            <w:shd w:val="clear" w:color="auto" w:fill="FFFFFF"/>
+            <w:tcMar>
+              <w:top w:w="0" w:type="dxa"/>
+              <w:bottom w:w="0" w:type="dxa"/>
+              <w:left w:w="0" w:type="dxa"/>
+              <w:right w:w="0" w:type="dxa"/>
+            </w:tcMar>
+            <w:vAlign w:val="center"/>
+          </w:tcPr>
+          <w:p>
+            <w:pPr>
+              <w:pStyle w:val="Normal"/>
+              <w:jc w:val="left"/>
+              <w:pBdr>
+                <w:bottom w:val="none" w:sz="0" w:space="0" w:color="000000"/>
+                <w:top w:val="none" w:sz="0" w:space="0" w:color="000000"/>
+                <w:left w:val="none" w:sz="0" w:space="0" w:color="000000"/>
+                <w:right w:val="none" w:sz="0" w:space="0" w:color="000000"/>
+              </w:pBdr>
+              <w:spacing w:after="100" w:before="100" w:line="240"/>
+              <w:ind w:left="100" w:right="100" w:firstLine="0" w:firstLineChars="0"/>
+              <w:rPr>
+                <w:rFonts w:ascii="Helvetica" w:hAnsi="Helvetica" w:eastAsia="Helvetica" w:cs="Helvetica"/>
+                <w:i w:val="false"/>
+                <w:b w:val="false"/>
+                <w:u w:val="none"/>
+                <w:strike w:val="false"/>
+                <w:sz w:val="22"/>
+                <w:szCs w:val="22"/>
+                <w:color w:val="000000"/>
+              </w:rPr>
+            </w:pPr>
+            <w:r>
+              <w:rPr>
+                <w:rFonts w:ascii="Helvetica" w:hAnsi="Helvetica" w:eastAsia="Helvetica" w:cs="Helvetica"/>
+                <w:i w:val="false"/>
+                <w:b w:val="false"/>
+                <w:u w:val="none"/>
+                <w:strike w:val="false"/>
+                <w:sz w:val="22"/>
+                <w:szCs w:val="22"/>
+                <w:color w:val="000000"/>
+              </w:rPr>
+              <w:t xml:space="preserve">***</w:t>
             </w:r>
           </w:p>
         </w:tc>
@@ -1081,7 +1192,7 @@
                 <w:szCs w:val="22"/>
                 <w:color w:val="000000"/>
               </w:rPr>
-              <w:t xml:space="preserve">29.0</w:t>
+              <w:t xml:space="preserve">28</w:t>
             </w:r>
           </w:p>
         </w:tc>
@@ -1136,7 +1247,62 @@
                 <w:szCs w:val="22"/>
                 <w:color w:val="000000"/>
               </w:rPr>
-              <w:t xml:space="preserve">0.0000</w:t>
+              <w:t xml:space="preserve">0</w:t>
+            </w:r>
+          </w:p>
+        </w:tc>
+        <w:tc>
+          <w:tcPr>
+            <w:tcBorders>
+              <w:bottom w:val="none" w:sz="0" w:space="0" w:color="000000"/>
+              <w:top w:val="none" w:sz="0" w:space="0" w:color="000000"/>
+              <w:left w:val="none" w:sz="0" w:space="0" w:color="000000"/>
+              <w:right w:val="none" w:sz="0" w:space="0" w:color="000000"/>
+            </w:tcBorders>
+            <w:shd w:val="clear" w:color="auto" w:fill="FFFFFF"/>
+            <w:tcMar>
+              <w:top w:w="0" w:type="dxa"/>
+              <w:bottom w:w="0" w:type="dxa"/>
+              <w:left w:w="0" w:type="dxa"/>
+              <w:right w:w="0" w:type="dxa"/>
+            </w:tcMar>
+            <w:vAlign w:val="center"/>
+          </w:tcPr>
+          <w:p>
+            <w:pPr>
+              <w:pStyle w:val="Normal"/>
+              <w:jc w:val="left"/>
+              <w:pBdr>
+                <w:bottom w:val="none" w:sz="0" w:space="0" w:color="000000"/>
+                <w:top w:val="none" w:sz="0" w:space="0" w:color="000000"/>
+                <w:left w:val="none" w:sz="0" w:space="0" w:color="000000"/>
+                <w:right w:val="none" w:sz="0" w:space="0" w:color="000000"/>
+              </w:pBdr>
+              <w:spacing w:after="100" w:before="100" w:line="240"/>
+              <w:ind w:left="100" w:right="100" w:firstLine="0" w:firstLineChars="0"/>
+              <w:rPr>
+                <w:rFonts w:ascii="Helvetica" w:hAnsi="Helvetica" w:eastAsia="Helvetica" w:cs="Helvetica"/>
+                <w:i w:val="false"/>
+                <w:b w:val="false"/>
+                <w:u w:val="none"/>
+                <w:strike w:val="false"/>
+                <w:sz w:val="22"/>
+                <w:szCs w:val="22"/>
+                <w:color w:val="000000"/>
+              </w:rPr>
+            </w:pPr>
+            <w:r>
+              <w:rPr>
+                <w:rFonts w:ascii="Helvetica" w:hAnsi="Helvetica" w:eastAsia="Helvetica" w:cs="Helvetica"/>
+                <w:i w:val="false"/>
+                <w:b w:val="false"/>
+                <w:u w:val="none"/>
+                <w:strike w:val="false"/>
+                <w:sz w:val="22"/>
+                <w:szCs w:val="22"/>
+                <w:color w:val="000000"/>
+              </w:rPr>
+              <w:t xml:space="preserve">&lt;0.001</w:t>
             </w:r>
           </w:p>
         </w:tc>
@@ -1471,7 +1637,7 @@
                 <w:szCs w:val="22"/>
                 <w:color w:val="000000"/>
               </w:rPr>
-              <w:t xml:space="preserve">16.0</w:t>
+              <w:t xml:space="preserve">28</w:t>
             </w:r>
           </w:p>
         </w:tc>
@@ -1526,7 +1692,62 @@
                 <w:szCs w:val="22"/>
                 <w:color w:val="000000"/>
               </w:rPr>
-              <w:t xml:space="preserve">0.0000</w:t>
+              <w:t xml:space="preserve">0</w:t>
+            </w:r>
+          </w:p>
+        </w:tc>
+        <w:tc>
+          <w:tcPr>
+            <w:tcBorders>
+              <w:bottom w:val="none" w:sz="0" w:space="0" w:color="000000"/>
+              <w:top w:val="none" w:sz="0" w:space="0" w:color="000000"/>
+              <w:left w:val="none" w:sz="0" w:space="0" w:color="000000"/>
+              <w:right w:val="none" w:sz="0" w:space="0" w:color="000000"/>
+            </w:tcBorders>
+            <w:shd w:val="clear" w:color="auto" w:fill="FFFFFF"/>
+            <w:tcMar>
+              <w:top w:w="0" w:type="dxa"/>
+              <w:bottom w:w="0" w:type="dxa"/>
+              <w:left w:w="0" w:type="dxa"/>
+              <w:right w:w="0" w:type="dxa"/>
+            </w:tcMar>
+            <w:vAlign w:val="center"/>
+          </w:tcPr>
+          <w:p>
+            <w:pPr>
+              <w:pStyle w:val="Normal"/>
+              <w:jc w:val="left"/>
+              <w:pBdr>
+                <w:bottom w:val="none" w:sz="0" w:space="0" w:color="000000"/>
+                <w:top w:val="none" w:sz="0" w:space="0" w:color="000000"/>
+                <w:left w:val="none" w:sz="0" w:space="0" w:color="000000"/>
+                <w:right w:val="none" w:sz="0" w:space="0" w:color="000000"/>
+              </w:pBdr>
+              <w:spacing w:after="100" w:before="100" w:line="240"/>
+              <w:ind w:left="100" w:right="100" w:firstLine="0" w:firstLineChars="0"/>
+              <w:rPr>
+                <w:rFonts w:ascii="Helvetica" w:hAnsi="Helvetica" w:eastAsia="Helvetica" w:cs="Helvetica"/>
+                <w:i w:val="false"/>
+                <w:b w:val="false"/>
+                <w:u w:val="none"/>
+                <w:strike w:val="false"/>
+                <w:sz w:val="22"/>
+                <w:szCs w:val="22"/>
+                <w:color w:val="000000"/>
+              </w:rPr>
+            </w:pPr>
+            <w:r>
+              <w:rPr>
+                <w:rFonts w:ascii="Helvetica" w:hAnsi="Helvetica" w:eastAsia="Helvetica" w:cs="Helvetica"/>
+                <w:i w:val="false"/>
+                <w:b w:val="false"/>
+                <w:u w:val="none"/>
+                <w:strike w:val="false"/>
+                <w:sz w:val="22"/>
+                <w:szCs w:val="22"/>
+                <w:color w:val="000000"/>
+              </w:rPr>
+              <w:t xml:space="preserve">&lt;0.001</w:t>
             </w:r>
           </w:p>
         </w:tc>
@@ -1861,7 +2082,7 @@
                 <w:szCs w:val="22"/>
                 <w:color w:val="000000"/>
               </w:rPr>
-              <w:t xml:space="preserve">528.0</w:t>
+              <w:t xml:space="preserve">28</w:t>
             </w:r>
           </w:p>
         </w:tc>
@@ -1916,62 +2137,117 @@
                 <w:szCs w:val="22"/>
                 <w:color w:val="000000"/>
               </w:rPr>
-              <w:t xml:space="preserve">0.0264</w:t>
-            </w:r>
-          </w:p>
-        </w:tc>
-        <w:tc>
-          <w:tcPr>
-            <w:tcBorders>
-              <w:bottom w:val="none" w:sz="0" w:space="0" w:color="000000"/>
-              <w:top w:val="none" w:sz="0" w:space="0" w:color="000000"/>
-              <w:left w:val="none" w:sz="0" w:space="0" w:color="000000"/>
-              <w:right w:val="none" w:sz="0" w:space="0" w:color="000000"/>
-            </w:tcBorders>
-            <w:shd w:val="clear" w:color="auto" w:fill="FFFFFF"/>
-            <w:tcMar>
-              <w:top w:w="0" w:type="dxa"/>
-              <w:bottom w:w="0" w:type="dxa"/>
-              <w:left w:w="0" w:type="dxa"/>
-              <w:right w:w="0" w:type="dxa"/>
-            </w:tcMar>
-            <w:vAlign w:val="center"/>
-          </w:tcPr>
-          <w:p>
-            <w:pPr>
-              <w:pStyle w:val="Normal"/>
-              <w:jc w:val="left"/>
-              <w:pBdr>
-                <w:bottom w:val="none" w:sz="0" w:space="0" w:color="000000"/>
-                <w:top w:val="none" w:sz="0" w:space="0" w:color="000000"/>
-                <w:left w:val="none" w:sz="0" w:space="0" w:color="000000"/>
-                <w:right w:val="none" w:sz="0" w:space="0" w:color="000000"/>
-              </w:pBdr>
-              <w:spacing w:after="100" w:before="100" w:line="240"/>
-              <w:ind w:left="100" w:right="100" w:firstLine="0" w:firstLineChars="0"/>
-              <w:rPr>
-                <w:rFonts w:ascii="Helvetica" w:hAnsi="Helvetica" w:eastAsia="Helvetica" w:cs="Helvetica"/>
-                <w:i w:val="false"/>
-                <w:b w:val="false"/>
-                <w:u w:val="none"/>
-                <w:strike w:val="false"/>
-                <w:sz w:val="22"/>
-                <w:szCs w:val="22"/>
-                <w:color w:val="000000"/>
-              </w:rPr>
-            </w:pPr>
-            <w:r>
-              <w:rPr>
-                <w:rFonts w:ascii="Helvetica" w:hAnsi="Helvetica" w:eastAsia="Helvetica" w:cs="Helvetica"/>
-                <w:i w:val="false"/>
-                <w:b w:val="false"/>
-                <w:u w:val="none"/>
-                <w:strike w:val="false"/>
-                <w:sz w:val="22"/>
-                <w:szCs w:val="22"/>
-                <w:color w:val="000000"/>
-              </w:rPr>
-              <w:t xml:space="preserve">*</w:t>
+              <w:t xml:space="preserve">406</w:t>
+            </w:r>
+          </w:p>
+        </w:tc>
+        <w:tc>
+          <w:tcPr>
+            <w:tcBorders>
+              <w:bottom w:val="none" w:sz="0" w:space="0" w:color="000000"/>
+              <w:top w:val="none" w:sz="0" w:space="0" w:color="000000"/>
+              <w:left w:val="none" w:sz="0" w:space="0" w:color="000000"/>
+              <w:right w:val="none" w:sz="0" w:space="0" w:color="000000"/>
+            </w:tcBorders>
+            <w:shd w:val="clear" w:color="auto" w:fill="FFFFFF"/>
+            <w:tcMar>
+              <w:top w:w="0" w:type="dxa"/>
+              <w:bottom w:w="0" w:type="dxa"/>
+              <w:left w:w="0" w:type="dxa"/>
+              <w:right w:w="0" w:type="dxa"/>
+            </w:tcMar>
+            <w:vAlign w:val="center"/>
+          </w:tcPr>
+          <w:p>
+            <w:pPr>
+              <w:pStyle w:val="Normal"/>
+              <w:jc w:val="left"/>
+              <w:pBdr>
+                <w:bottom w:val="none" w:sz="0" w:space="0" w:color="000000"/>
+                <w:top w:val="none" w:sz="0" w:space="0" w:color="000000"/>
+                <w:left w:val="none" w:sz="0" w:space="0" w:color="000000"/>
+                <w:right w:val="none" w:sz="0" w:space="0" w:color="000000"/>
+              </w:pBdr>
+              <w:spacing w:after="100" w:before="100" w:line="240"/>
+              <w:ind w:left="100" w:right="100" w:firstLine="0" w:firstLineChars="0"/>
+              <w:rPr>
+                <w:rFonts w:ascii="Helvetica" w:hAnsi="Helvetica" w:eastAsia="Helvetica" w:cs="Helvetica"/>
+                <w:i w:val="false"/>
+                <w:b w:val="false"/>
+                <w:u w:val="none"/>
+                <w:strike w:val="false"/>
+                <w:sz w:val="22"/>
+                <w:szCs w:val="22"/>
+                <w:color w:val="000000"/>
+              </w:rPr>
+            </w:pPr>
+            <w:r>
+              <w:rPr>
+                <w:rFonts w:ascii="Helvetica" w:hAnsi="Helvetica" w:eastAsia="Helvetica" w:cs="Helvetica"/>
+                <w:i w:val="false"/>
+                <w:b w:val="false"/>
+                <w:u w:val="none"/>
+                <w:strike w:val="false"/>
+                <w:sz w:val="22"/>
+                <w:szCs w:val="22"/>
+                <w:color w:val="000000"/>
+              </w:rPr>
+              <w:t xml:space="preserve">&lt;0.001</w:t>
+            </w:r>
+          </w:p>
+        </w:tc>
+        <w:tc>
+          <w:tcPr>
+            <w:tcBorders>
+              <w:bottom w:val="none" w:sz="0" w:space="0" w:color="000000"/>
+              <w:top w:val="none" w:sz="0" w:space="0" w:color="000000"/>
+              <w:left w:val="none" w:sz="0" w:space="0" w:color="000000"/>
+              <w:right w:val="none" w:sz="0" w:space="0" w:color="000000"/>
+            </w:tcBorders>
+            <w:shd w:val="clear" w:color="auto" w:fill="FFFFFF"/>
+            <w:tcMar>
+              <w:top w:w="0" w:type="dxa"/>
+              <w:bottom w:w="0" w:type="dxa"/>
+              <w:left w:w="0" w:type="dxa"/>
+              <w:right w:w="0" w:type="dxa"/>
+            </w:tcMar>
+            <w:vAlign w:val="center"/>
+          </w:tcPr>
+          <w:p>
+            <w:pPr>
+              <w:pStyle w:val="Normal"/>
+              <w:jc w:val="left"/>
+              <w:pBdr>
+                <w:bottom w:val="none" w:sz="0" w:space="0" w:color="000000"/>
+                <w:top w:val="none" w:sz="0" w:space="0" w:color="000000"/>
+                <w:left w:val="none" w:sz="0" w:space="0" w:color="000000"/>
+                <w:right w:val="none" w:sz="0" w:space="0" w:color="000000"/>
+              </w:pBdr>
+              <w:spacing w:after="100" w:before="100" w:line="240"/>
+              <w:ind w:left="100" w:right="100" w:firstLine="0" w:firstLineChars="0"/>
+              <w:rPr>
+                <w:rFonts w:ascii="Helvetica" w:hAnsi="Helvetica" w:eastAsia="Helvetica" w:cs="Helvetica"/>
+                <w:i w:val="false"/>
+                <w:b w:val="false"/>
+                <w:u w:val="none"/>
+                <w:strike w:val="false"/>
+                <w:sz w:val="22"/>
+                <w:szCs w:val="22"/>
+                <w:color w:val="000000"/>
+              </w:rPr>
+            </w:pPr>
+            <w:r>
+              <w:rPr>
+                <w:rFonts w:ascii="Helvetica" w:hAnsi="Helvetica" w:eastAsia="Helvetica" w:cs="Helvetica"/>
+                <w:i w:val="false"/>
+                <w:b w:val="false"/>
+                <w:u w:val="none"/>
+                <w:strike w:val="false"/>
+                <w:sz w:val="22"/>
+                <w:szCs w:val="22"/>
+                <w:color w:val="000000"/>
+              </w:rPr>
+              <w:t xml:space="preserve">***</w:t>
             </w:r>
           </w:p>
         </w:tc>
@@ -2251,7 +2527,7 @@
                 <w:szCs w:val="22"/>
                 <w:color w:val="000000"/>
               </w:rPr>
-              <w:t xml:space="preserve">25.0</w:t>
+              <w:t xml:space="preserve">28</w:t>
             </w:r>
           </w:p>
         </w:tc>
@@ -2306,7 +2582,62 @@
                 <w:szCs w:val="22"/>
                 <w:color w:val="000000"/>
               </w:rPr>
-              <w:t xml:space="preserve">0.0000</w:t>
+              <w:t xml:space="preserve">0</w:t>
+            </w:r>
+          </w:p>
+        </w:tc>
+        <w:tc>
+          <w:tcPr>
+            <w:tcBorders>
+              <w:bottom w:val="none" w:sz="0" w:space="0" w:color="000000"/>
+              <w:top w:val="none" w:sz="0" w:space="0" w:color="000000"/>
+              <w:left w:val="none" w:sz="0" w:space="0" w:color="000000"/>
+              <w:right w:val="none" w:sz="0" w:space="0" w:color="000000"/>
+            </w:tcBorders>
+            <w:shd w:val="clear" w:color="auto" w:fill="FFFFFF"/>
+            <w:tcMar>
+              <w:top w:w="0" w:type="dxa"/>
+              <w:bottom w:w="0" w:type="dxa"/>
+              <w:left w:w="0" w:type="dxa"/>
+              <w:right w:w="0" w:type="dxa"/>
+            </w:tcMar>
+            <w:vAlign w:val="center"/>
+          </w:tcPr>
+          <w:p>
+            <w:pPr>
+              <w:pStyle w:val="Normal"/>
+              <w:jc w:val="left"/>
+              <w:pBdr>
+                <w:bottom w:val="none" w:sz="0" w:space="0" w:color="000000"/>
+                <w:top w:val="none" w:sz="0" w:space="0" w:color="000000"/>
+                <w:left w:val="none" w:sz="0" w:space="0" w:color="000000"/>
+                <w:right w:val="none" w:sz="0" w:space="0" w:color="000000"/>
+              </w:pBdr>
+              <w:spacing w:after="100" w:before="100" w:line="240"/>
+              <w:ind w:left="100" w:right="100" w:firstLine="0" w:firstLineChars="0"/>
+              <w:rPr>
+                <w:rFonts w:ascii="Helvetica" w:hAnsi="Helvetica" w:eastAsia="Helvetica" w:cs="Helvetica"/>
+                <w:i w:val="false"/>
+                <w:b w:val="false"/>
+                <w:u w:val="none"/>
+                <w:strike w:val="false"/>
+                <w:sz w:val="22"/>
+                <w:szCs w:val="22"/>
+                <w:color w:val="000000"/>
+              </w:rPr>
+            </w:pPr>
+            <w:r>
+              <w:rPr>
+                <w:rFonts w:ascii="Helvetica" w:hAnsi="Helvetica" w:eastAsia="Helvetica" w:cs="Helvetica"/>
+                <w:i w:val="false"/>
+                <w:b w:val="false"/>
+                <w:u w:val="none"/>
+                <w:strike w:val="false"/>
+                <w:sz w:val="22"/>
+                <w:szCs w:val="22"/>
+                <w:color w:val="000000"/>
+              </w:rPr>
+              <w:t xml:space="preserve">&lt;0.001</w:t>
             </w:r>
           </w:p>
         </w:tc>
@@ -2641,7 +2972,7 @@
                 <w:szCs w:val="22"/>
                 <w:color w:val="000000"/>
               </w:rPr>
-              <w:t xml:space="preserve">14.0</w:t>
+              <w:t xml:space="preserve">28</w:t>
             </w:r>
           </w:p>
         </w:tc>
@@ -2696,7 +3027,62 @@
                 <w:szCs w:val="22"/>
                 <w:color w:val="000000"/>
               </w:rPr>
-              <w:t xml:space="preserve">0.0000</w:t>
+              <w:t xml:space="preserve">0</w:t>
+            </w:r>
+          </w:p>
+        </w:tc>
+        <w:tc>
+          <w:tcPr>
+            <w:tcBorders>
+              <w:bottom w:val="none" w:sz="0" w:space="0" w:color="000000"/>
+              <w:top w:val="none" w:sz="0" w:space="0" w:color="000000"/>
+              <w:left w:val="none" w:sz="0" w:space="0" w:color="000000"/>
+              <w:right w:val="none" w:sz="0" w:space="0" w:color="000000"/>
+            </w:tcBorders>
+            <w:shd w:val="clear" w:color="auto" w:fill="FFFFFF"/>
+            <w:tcMar>
+              <w:top w:w="0" w:type="dxa"/>
+              <w:bottom w:w="0" w:type="dxa"/>
+              <w:left w:w="0" w:type="dxa"/>
+              <w:right w:w="0" w:type="dxa"/>
+            </w:tcMar>
+            <w:vAlign w:val="center"/>
+          </w:tcPr>
+          <w:p>
+            <w:pPr>
+              <w:pStyle w:val="Normal"/>
+              <w:jc w:val="left"/>
+              <w:pBdr>
+                <w:bottom w:val="none" w:sz="0" w:space="0" w:color="000000"/>
+                <w:top w:val="none" w:sz="0" w:space="0" w:color="000000"/>
+                <w:left w:val="none" w:sz="0" w:space="0" w:color="000000"/>
+                <w:right w:val="none" w:sz="0" w:space="0" w:color="000000"/>
+              </w:pBdr>
+              <w:spacing w:after="100" w:before="100" w:line="240"/>
+              <w:ind w:left="100" w:right="100" w:firstLine="0" w:firstLineChars="0"/>
+              <w:rPr>
+                <w:rFonts w:ascii="Helvetica" w:hAnsi="Helvetica" w:eastAsia="Helvetica" w:cs="Helvetica"/>
+                <w:i w:val="false"/>
+                <w:b w:val="false"/>
+                <w:u w:val="none"/>
+                <w:strike w:val="false"/>
+                <w:sz w:val="22"/>
+                <w:szCs w:val="22"/>
+                <w:color w:val="000000"/>
+              </w:rPr>
+            </w:pPr>
+            <w:r>
+              <w:rPr>
+                <w:rFonts w:ascii="Helvetica" w:hAnsi="Helvetica" w:eastAsia="Helvetica" w:cs="Helvetica"/>
+                <w:i w:val="false"/>
+                <w:b w:val="false"/>
+                <w:u w:val="none"/>
+                <w:strike w:val="false"/>
+                <w:sz w:val="22"/>
+                <w:szCs w:val="22"/>
+                <w:color w:val="000000"/>
+              </w:rPr>
+              <w:t xml:space="preserve">&lt;0.001</w:t>
             </w:r>
           </w:p>
         </w:tc>
@@ -3031,7 +3417,7 @@
                 <w:szCs w:val="22"/>
                 <w:color w:val="000000"/>
               </w:rPr>
-              <w:t xml:space="preserve">503.0</w:t>
+              <w:t xml:space="preserve">28</w:t>
             </w:r>
           </w:p>
         </w:tc>
@@ -3086,62 +3472,117 @@
                 <w:szCs w:val="22"/>
                 <w:color w:val="000000"/>
               </w:rPr>
-              <w:t xml:space="preserve">0.0702</w:t>
-            </w:r>
-          </w:p>
-        </w:tc>
-        <w:tc>
-          <w:tcPr>
-            <w:tcBorders>
-              <w:bottom w:val="none" w:sz="0" w:space="0" w:color="000000"/>
-              <w:top w:val="none" w:sz="0" w:space="0" w:color="000000"/>
-              <w:left w:val="none" w:sz="0" w:space="0" w:color="000000"/>
-              <w:right w:val="none" w:sz="0" w:space="0" w:color="000000"/>
-            </w:tcBorders>
-            <w:shd w:val="clear" w:color="auto" w:fill="FFFFFF"/>
-            <w:tcMar>
-              <w:top w:w="0" w:type="dxa"/>
-              <w:bottom w:w="0" w:type="dxa"/>
-              <w:left w:w="0" w:type="dxa"/>
-              <w:right w:w="0" w:type="dxa"/>
-            </w:tcMar>
-            <w:vAlign w:val="center"/>
-          </w:tcPr>
-          <w:p>
-            <w:pPr>
-              <w:pStyle w:val="Normal"/>
-              <w:jc w:val="left"/>
-              <w:pBdr>
-                <w:bottom w:val="none" w:sz="0" w:space="0" w:color="000000"/>
-                <w:top w:val="none" w:sz="0" w:space="0" w:color="000000"/>
-                <w:left w:val="none" w:sz="0" w:space="0" w:color="000000"/>
-                <w:right w:val="none" w:sz="0" w:space="0" w:color="000000"/>
-              </w:pBdr>
-              <w:spacing w:after="100" w:before="100" w:line="240"/>
-              <w:ind w:left="100" w:right="100" w:firstLine="0" w:firstLineChars="0"/>
-              <w:rPr>
-                <w:rFonts w:ascii="Helvetica" w:hAnsi="Helvetica" w:eastAsia="Helvetica" w:cs="Helvetica"/>
-                <w:i w:val="false"/>
-                <w:b w:val="false"/>
-                <w:u w:val="none"/>
-                <w:strike w:val="false"/>
-                <w:sz w:val="22"/>
-                <w:szCs w:val="22"/>
-                <w:color w:val="000000"/>
-              </w:rPr>
-            </w:pPr>
-            <w:r>
-              <w:rPr>
-                <w:rFonts w:ascii="Helvetica" w:hAnsi="Helvetica" w:eastAsia="Helvetica" w:cs="Helvetica"/>
-                <w:i w:val="false"/>
-                <w:b w:val="false"/>
-                <w:u w:val="none"/>
-                <w:strike w:val="false"/>
-                <w:sz w:val="22"/>
-                <w:szCs w:val="22"/>
-                <w:color w:val="000000"/>
-              </w:rPr>
-              <w:t xml:space="preserve">ns</w:t>
+              <w:t xml:space="preserve">404</w:t>
+            </w:r>
+          </w:p>
+        </w:tc>
+        <w:tc>
+          <w:tcPr>
+            <w:tcBorders>
+              <w:bottom w:val="none" w:sz="0" w:space="0" w:color="000000"/>
+              <w:top w:val="none" w:sz="0" w:space="0" w:color="000000"/>
+              <w:left w:val="none" w:sz="0" w:space="0" w:color="000000"/>
+              <w:right w:val="none" w:sz="0" w:space="0" w:color="000000"/>
+            </w:tcBorders>
+            <w:shd w:val="clear" w:color="auto" w:fill="FFFFFF"/>
+            <w:tcMar>
+              <w:top w:w="0" w:type="dxa"/>
+              <w:bottom w:w="0" w:type="dxa"/>
+              <w:left w:w="0" w:type="dxa"/>
+              <w:right w:w="0" w:type="dxa"/>
+            </w:tcMar>
+            <w:vAlign w:val="center"/>
+          </w:tcPr>
+          <w:p>
+            <w:pPr>
+              <w:pStyle w:val="Normal"/>
+              <w:jc w:val="left"/>
+              <w:pBdr>
+                <w:bottom w:val="none" w:sz="0" w:space="0" w:color="000000"/>
+                <w:top w:val="none" w:sz="0" w:space="0" w:color="000000"/>
+                <w:left w:val="none" w:sz="0" w:space="0" w:color="000000"/>
+                <w:right w:val="none" w:sz="0" w:space="0" w:color="000000"/>
+              </w:pBdr>
+              <w:spacing w:after="100" w:before="100" w:line="240"/>
+              <w:ind w:left="100" w:right="100" w:firstLine="0" w:firstLineChars="0"/>
+              <w:rPr>
+                <w:rFonts w:ascii="Helvetica" w:hAnsi="Helvetica" w:eastAsia="Helvetica" w:cs="Helvetica"/>
+                <w:i w:val="false"/>
+                <w:b w:val="false"/>
+                <w:u w:val="none"/>
+                <w:strike w:val="false"/>
+                <w:sz w:val="22"/>
+                <w:szCs w:val="22"/>
+                <w:color w:val="000000"/>
+              </w:rPr>
+            </w:pPr>
+            <w:r>
+              <w:rPr>
+                <w:rFonts w:ascii="Helvetica" w:hAnsi="Helvetica" w:eastAsia="Helvetica" w:cs="Helvetica"/>
+                <w:i w:val="false"/>
+                <w:b w:val="false"/>
+                <w:u w:val="none"/>
+                <w:strike w:val="false"/>
+                <w:sz w:val="22"/>
+                <w:szCs w:val="22"/>
+                <w:color w:val="000000"/>
+              </w:rPr>
+              <w:t xml:space="preserve">&lt;0.001</w:t>
+            </w:r>
+          </w:p>
+        </w:tc>
+        <w:tc>
+          <w:tcPr>
+            <w:tcBorders>
+              <w:bottom w:val="none" w:sz="0" w:space="0" w:color="000000"/>
+              <w:top w:val="none" w:sz="0" w:space="0" w:color="000000"/>
+              <w:left w:val="none" w:sz="0" w:space="0" w:color="000000"/>
+              <w:right w:val="none" w:sz="0" w:space="0" w:color="000000"/>
+            </w:tcBorders>
+            <w:shd w:val="clear" w:color="auto" w:fill="FFFFFF"/>
+            <w:tcMar>
+              <w:top w:w="0" w:type="dxa"/>
+              <w:bottom w:w="0" w:type="dxa"/>
+              <w:left w:w="0" w:type="dxa"/>
+              <w:right w:w="0" w:type="dxa"/>
+            </w:tcMar>
+            <w:vAlign w:val="center"/>
+          </w:tcPr>
+          <w:p>
+            <w:pPr>
+              <w:pStyle w:val="Normal"/>
+              <w:jc w:val="left"/>
+              <w:pBdr>
+                <w:bottom w:val="none" w:sz="0" w:space="0" w:color="000000"/>
+                <w:top w:val="none" w:sz="0" w:space="0" w:color="000000"/>
+                <w:left w:val="none" w:sz="0" w:space="0" w:color="000000"/>
+                <w:right w:val="none" w:sz="0" w:space="0" w:color="000000"/>
+              </w:pBdr>
+              <w:spacing w:after="100" w:before="100" w:line="240"/>
+              <w:ind w:left="100" w:right="100" w:firstLine="0" w:firstLineChars="0"/>
+              <w:rPr>
+                <w:rFonts w:ascii="Helvetica" w:hAnsi="Helvetica" w:eastAsia="Helvetica" w:cs="Helvetica"/>
+                <w:i w:val="false"/>
+                <w:b w:val="false"/>
+                <w:u w:val="none"/>
+                <w:strike w:val="false"/>
+                <w:sz w:val="22"/>
+                <w:szCs w:val="22"/>
+                <w:color w:val="000000"/>
+              </w:rPr>
+            </w:pPr>
+            <w:r>
+              <w:rPr>
+                <w:rFonts w:ascii="Helvetica" w:hAnsi="Helvetica" w:eastAsia="Helvetica" w:cs="Helvetica"/>
+                <w:i w:val="false"/>
+                <w:b w:val="false"/>
+                <w:u w:val="none"/>
+                <w:strike w:val="false"/>
+                <w:sz w:val="22"/>
+                <w:szCs w:val="22"/>
+                <w:color w:val="000000"/>
+              </w:rPr>
+              <w:t xml:space="preserve">***</w:t>
             </w:r>
           </w:p>
         </w:tc>
@@ -3421,7 +3862,7 @@
                 <w:szCs w:val="22"/>
                 <w:color w:val="000000"/>
               </w:rPr>
-              <w:t xml:space="preserve">34.0</w:t>
+              <w:t xml:space="preserve">28</w:t>
             </w:r>
           </w:p>
         </w:tc>
@@ -3476,7 +3917,62 @@
                 <w:szCs w:val="22"/>
                 <w:color w:val="000000"/>
               </w:rPr>
-              <w:t xml:space="preserve">0.0000</w:t>
+              <w:t xml:space="preserve">3</w:t>
+            </w:r>
+          </w:p>
+        </w:tc>
+        <w:tc>
+          <w:tcPr>
+            <w:tcBorders>
+              <w:bottom w:val="none" w:sz="0" w:space="0" w:color="000000"/>
+              <w:top w:val="none" w:sz="0" w:space="0" w:color="000000"/>
+              <w:left w:val="none" w:sz="0" w:space="0" w:color="000000"/>
+              <w:right w:val="none" w:sz="0" w:space="0" w:color="000000"/>
+            </w:tcBorders>
+            <w:shd w:val="clear" w:color="auto" w:fill="FFFFFF"/>
+            <w:tcMar>
+              <w:top w:w="0" w:type="dxa"/>
+              <w:bottom w:w="0" w:type="dxa"/>
+              <w:left w:w="0" w:type="dxa"/>
+              <w:right w:w="0" w:type="dxa"/>
+            </w:tcMar>
+            <w:vAlign w:val="center"/>
+          </w:tcPr>
+          <w:p>
+            <w:pPr>
+              <w:pStyle w:val="Normal"/>
+              <w:jc w:val="left"/>
+              <w:pBdr>
+                <w:bottom w:val="none" w:sz="0" w:space="0" w:color="000000"/>
+                <w:top w:val="none" w:sz="0" w:space="0" w:color="000000"/>
+                <w:left w:val="none" w:sz="0" w:space="0" w:color="000000"/>
+                <w:right w:val="none" w:sz="0" w:space="0" w:color="000000"/>
+              </w:pBdr>
+              <w:spacing w:after="100" w:before="100" w:line="240"/>
+              <w:ind w:left="100" w:right="100" w:firstLine="0" w:firstLineChars="0"/>
+              <w:rPr>
+                <w:rFonts w:ascii="Helvetica" w:hAnsi="Helvetica" w:eastAsia="Helvetica" w:cs="Helvetica"/>
+                <w:i w:val="false"/>
+                <w:b w:val="false"/>
+                <w:u w:val="none"/>
+                <w:strike w:val="false"/>
+                <w:sz w:val="22"/>
+                <w:szCs w:val="22"/>
+                <w:color w:val="000000"/>
+              </w:rPr>
+            </w:pPr>
+            <w:r>
+              <w:rPr>
+                <w:rFonts w:ascii="Helvetica" w:hAnsi="Helvetica" w:eastAsia="Helvetica" w:cs="Helvetica"/>
+                <w:i w:val="false"/>
+                <w:b w:val="false"/>
+                <w:u w:val="none"/>
+                <w:strike w:val="false"/>
+                <w:sz w:val="22"/>
+                <w:szCs w:val="22"/>
+                <w:color w:val="000000"/>
+              </w:rPr>
+              <w:t xml:space="preserve">&lt;0.001</w:t>
             </w:r>
           </w:p>
         </w:tc>
@@ -3811,7 +4307,7 @@
                 <w:szCs w:val="22"/>
                 <w:color w:val="000000"/>
               </w:rPr>
-              <w:t xml:space="preserve">19.0</w:t>
+              <w:t xml:space="preserve">28</w:t>
             </w:r>
           </w:p>
         </w:tc>
@@ -3866,7 +4362,62 @@
                 <w:szCs w:val="22"/>
                 <w:color w:val="000000"/>
               </w:rPr>
-              <w:t xml:space="preserve">0.0000</w:t>
+              <w:t xml:space="preserve">3</w:t>
+            </w:r>
+          </w:p>
+        </w:tc>
+        <w:tc>
+          <w:tcPr>
+            <w:tcBorders>
+              <w:bottom w:val="none" w:sz="0" w:space="0" w:color="000000"/>
+              <w:top w:val="none" w:sz="0" w:space="0" w:color="000000"/>
+              <w:left w:val="none" w:sz="0" w:space="0" w:color="000000"/>
+              <w:right w:val="none" w:sz="0" w:space="0" w:color="000000"/>
+            </w:tcBorders>
+            <w:shd w:val="clear" w:color="auto" w:fill="FFFFFF"/>
+            <w:tcMar>
+              <w:top w:w="0" w:type="dxa"/>
+              <w:bottom w:w="0" w:type="dxa"/>
+              <w:left w:w="0" w:type="dxa"/>
+              <w:right w:w="0" w:type="dxa"/>
+            </w:tcMar>
+            <w:vAlign w:val="center"/>
+          </w:tcPr>
+          <w:p>
+            <w:pPr>
+              <w:pStyle w:val="Normal"/>
+              <w:jc w:val="left"/>
+              <w:pBdr>
+                <w:bottom w:val="none" w:sz="0" w:space="0" w:color="000000"/>
+                <w:top w:val="none" w:sz="0" w:space="0" w:color="000000"/>
+                <w:left w:val="none" w:sz="0" w:space="0" w:color="000000"/>
+                <w:right w:val="none" w:sz="0" w:space="0" w:color="000000"/>
+              </w:pBdr>
+              <w:spacing w:after="100" w:before="100" w:line="240"/>
+              <w:ind w:left="100" w:right="100" w:firstLine="0" w:firstLineChars="0"/>
+              <w:rPr>
+                <w:rFonts w:ascii="Helvetica" w:hAnsi="Helvetica" w:eastAsia="Helvetica" w:cs="Helvetica"/>
+                <w:i w:val="false"/>
+                <w:b w:val="false"/>
+                <w:u w:val="none"/>
+                <w:strike w:val="false"/>
+                <w:sz w:val="22"/>
+                <w:szCs w:val="22"/>
+                <w:color w:val="000000"/>
+              </w:rPr>
+            </w:pPr>
+            <w:r>
+              <w:rPr>
+                <w:rFonts w:ascii="Helvetica" w:hAnsi="Helvetica" w:eastAsia="Helvetica" w:cs="Helvetica"/>
+                <w:i w:val="false"/>
+                <w:b w:val="false"/>
+                <w:u w:val="none"/>
+                <w:strike w:val="false"/>
+                <w:sz w:val="22"/>
+                <w:szCs w:val="22"/>
+                <w:color w:val="000000"/>
+              </w:rPr>
+              <w:t xml:space="preserve">&lt;0.001</w:t>
             </w:r>
           </w:p>
         </w:tc>
@@ -4201,7 +4752,7 @@
                 <w:szCs w:val="22"/>
                 <w:color w:val="000000"/>
               </w:rPr>
-              <w:t xml:space="preserve">497.0</w:t>
+              <w:t xml:space="preserve">28</w:t>
             </w:r>
           </w:p>
         </w:tc>
@@ -4256,62 +4807,117 @@
                 <w:szCs w:val="22"/>
                 <w:color w:val="000000"/>
               </w:rPr>
-              <w:t xml:space="preserve">0.0868</w:t>
-            </w:r>
-          </w:p>
-        </w:tc>
-        <w:tc>
-          <w:tcPr>
-            <w:tcBorders>
-              <w:bottom w:val="none" w:sz="0" w:space="0" w:color="000000"/>
-              <w:top w:val="none" w:sz="0" w:space="0" w:color="000000"/>
-              <w:left w:val="none" w:sz="0" w:space="0" w:color="000000"/>
-              <w:right w:val="none" w:sz="0" w:space="0" w:color="000000"/>
-            </w:tcBorders>
-            <w:shd w:val="clear" w:color="auto" w:fill="FFFFFF"/>
-            <w:tcMar>
-              <w:top w:w="0" w:type="dxa"/>
-              <w:bottom w:w="0" w:type="dxa"/>
-              <w:left w:w="0" w:type="dxa"/>
-              <w:right w:w="0" w:type="dxa"/>
-            </w:tcMar>
-            <w:vAlign w:val="center"/>
-          </w:tcPr>
-          <w:p>
-            <w:pPr>
-              <w:pStyle w:val="Normal"/>
-              <w:jc w:val="left"/>
-              <w:pBdr>
-                <w:bottom w:val="none" w:sz="0" w:space="0" w:color="000000"/>
-                <w:top w:val="none" w:sz="0" w:space="0" w:color="000000"/>
-                <w:left w:val="none" w:sz="0" w:space="0" w:color="000000"/>
-                <w:right w:val="none" w:sz="0" w:space="0" w:color="000000"/>
-              </w:pBdr>
-              <w:spacing w:after="100" w:before="100" w:line="240"/>
-              <w:ind w:left="100" w:right="100" w:firstLine="0" w:firstLineChars="0"/>
-              <w:rPr>
-                <w:rFonts w:ascii="Helvetica" w:hAnsi="Helvetica" w:eastAsia="Helvetica" w:cs="Helvetica"/>
-                <w:i w:val="false"/>
-                <w:b w:val="false"/>
-                <w:u w:val="none"/>
-                <w:strike w:val="false"/>
-                <w:sz w:val="22"/>
-                <w:szCs w:val="22"/>
-                <w:color w:val="000000"/>
-              </w:rPr>
-            </w:pPr>
-            <w:r>
-              <w:rPr>
-                <w:rFonts w:ascii="Helvetica" w:hAnsi="Helvetica" w:eastAsia="Helvetica" w:cs="Helvetica"/>
-                <w:i w:val="false"/>
-                <w:b w:val="false"/>
-                <w:u w:val="none"/>
-                <w:strike w:val="false"/>
-                <w:sz w:val="22"/>
-                <w:szCs w:val="22"/>
-                <w:color w:val="000000"/>
-              </w:rPr>
-              <w:t xml:space="preserve">ns</w:t>
+              <w:t xml:space="preserve">398</w:t>
+            </w:r>
+          </w:p>
+        </w:tc>
+        <w:tc>
+          <w:tcPr>
+            <w:tcBorders>
+              <w:bottom w:val="none" w:sz="0" w:space="0" w:color="000000"/>
+              <w:top w:val="none" w:sz="0" w:space="0" w:color="000000"/>
+              <w:left w:val="none" w:sz="0" w:space="0" w:color="000000"/>
+              <w:right w:val="none" w:sz="0" w:space="0" w:color="000000"/>
+            </w:tcBorders>
+            <w:shd w:val="clear" w:color="auto" w:fill="FFFFFF"/>
+            <w:tcMar>
+              <w:top w:w="0" w:type="dxa"/>
+              <w:bottom w:w="0" w:type="dxa"/>
+              <w:left w:w="0" w:type="dxa"/>
+              <w:right w:w="0" w:type="dxa"/>
+            </w:tcMar>
+            <w:vAlign w:val="center"/>
+          </w:tcPr>
+          <w:p>
+            <w:pPr>
+              <w:pStyle w:val="Normal"/>
+              <w:jc w:val="left"/>
+              <w:pBdr>
+                <w:bottom w:val="none" w:sz="0" w:space="0" w:color="000000"/>
+                <w:top w:val="none" w:sz="0" w:space="0" w:color="000000"/>
+                <w:left w:val="none" w:sz="0" w:space="0" w:color="000000"/>
+                <w:right w:val="none" w:sz="0" w:space="0" w:color="000000"/>
+              </w:pBdr>
+              <w:spacing w:after="100" w:before="100" w:line="240"/>
+              <w:ind w:left="100" w:right="100" w:firstLine="0" w:firstLineChars="0"/>
+              <w:rPr>
+                <w:rFonts w:ascii="Helvetica" w:hAnsi="Helvetica" w:eastAsia="Helvetica" w:cs="Helvetica"/>
+                <w:i w:val="false"/>
+                <w:b w:val="false"/>
+                <w:u w:val="none"/>
+                <w:strike w:val="false"/>
+                <w:sz w:val="22"/>
+                <w:szCs w:val="22"/>
+                <w:color w:val="000000"/>
+              </w:rPr>
+            </w:pPr>
+            <w:r>
+              <w:rPr>
+                <w:rFonts w:ascii="Helvetica" w:hAnsi="Helvetica" w:eastAsia="Helvetica" w:cs="Helvetica"/>
+                <w:i w:val="false"/>
+                <w:b w:val="false"/>
+                <w:u w:val="none"/>
+                <w:strike w:val="false"/>
+                <w:sz w:val="22"/>
+                <w:szCs w:val="22"/>
+                <w:color w:val="000000"/>
+              </w:rPr>
+              <w:t xml:space="preserve">&lt;0.001</w:t>
+            </w:r>
+          </w:p>
+        </w:tc>
+        <w:tc>
+          <w:tcPr>
+            <w:tcBorders>
+              <w:bottom w:val="none" w:sz="0" w:space="0" w:color="000000"/>
+              <w:top w:val="none" w:sz="0" w:space="0" w:color="000000"/>
+              <w:left w:val="none" w:sz="0" w:space="0" w:color="000000"/>
+              <w:right w:val="none" w:sz="0" w:space="0" w:color="000000"/>
+            </w:tcBorders>
+            <w:shd w:val="clear" w:color="auto" w:fill="FFFFFF"/>
+            <w:tcMar>
+              <w:top w:w="0" w:type="dxa"/>
+              <w:bottom w:w="0" w:type="dxa"/>
+              <w:left w:w="0" w:type="dxa"/>
+              <w:right w:w="0" w:type="dxa"/>
+            </w:tcMar>
+            <w:vAlign w:val="center"/>
+          </w:tcPr>
+          <w:p>
+            <w:pPr>
+              <w:pStyle w:val="Normal"/>
+              <w:jc w:val="left"/>
+              <w:pBdr>
+                <w:bottom w:val="none" w:sz="0" w:space="0" w:color="000000"/>
+                <w:top w:val="none" w:sz="0" w:space="0" w:color="000000"/>
+                <w:left w:val="none" w:sz="0" w:space="0" w:color="000000"/>
+                <w:right w:val="none" w:sz="0" w:space="0" w:color="000000"/>
+              </w:pBdr>
+              <w:spacing w:after="100" w:before="100" w:line="240"/>
+              <w:ind w:left="100" w:right="100" w:firstLine="0" w:firstLineChars="0"/>
+              <w:rPr>
+                <w:rFonts w:ascii="Helvetica" w:hAnsi="Helvetica" w:eastAsia="Helvetica" w:cs="Helvetica"/>
+                <w:i w:val="false"/>
+                <w:b w:val="false"/>
+                <w:u w:val="none"/>
+                <w:strike w:val="false"/>
+                <w:sz w:val="22"/>
+                <w:szCs w:val="22"/>
+                <w:color w:val="000000"/>
+              </w:rPr>
+            </w:pPr>
+            <w:r>
+              <w:rPr>
+                <w:rFonts w:ascii="Helvetica" w:hAnsi="Helvetica" w:eastAsia="Helvetica" w:cs="Helvetica"/>
+                <w:i w:val="false"/>
+                <w:b w:val="false"/>
+                <w:u w:val="none"/>
+                <w:strike w:val="false"/>
+                <w:sz w:val="22"/>
+                <w:szCs w:val="22"/>
+                <w:color w:val="000000"/>
+              </w:rPr>
+              <w:t xml:space="preserve">***</w:t>
             </w:r>
           </w:p>
         </w:tc>
@@ -4591,7 +5197,7 @@
                 <w:szCs w:val="22"/>
                 <w:color w:val="000000"/>
               </w:rPr>
-              <w:t xml:space="preserve">26.0</w:t>
+              <w:t xml:space="preserve">28</w:t>
             </w:r>
           </w:p>
         </w:tc>
@@ -4646,7 +5252,62 @@
                 <w:szCs w:val="22"/>
                 <w:color w:val="000000"/>
               </w:rPr>
-              <w:t xml:space="preserve">0.0000</w:t>
+              <w:t xml:space="preserve">0</w:t>
+            </w:r>
+          </w:p>
+        </w:tc>
+        <w:tc>
+          <w:tcPr>
+            <w:tcBorders>
+              <w:bottom w:val="none" w:sz="0" w:space="0" w:color="000000"/>
+              <w:top w:val="none" w:sz="0" w:space="0" w:color="000000"/>
+              <w:left w:val="none" w:sz="0" w:space="0" w:color="000000"/>
+              <w:right w:val="none" w:sz="0" w:space="0" w:color="000000"/>
+            </w:tcBorders>
+            <w:shd w:val="clear" w:color="auto" w:fill="FFFFFF"/>
+            <w:tcMar>
+              <w:top w:w="0" w:type="dxa"/>
+              <w:bottom w:w="0" w:type="dxa"/>
+              <w:left w:w="0" w:type="dxa"/>
+              <w:right w:w="0" w:type="dxa"/>
+            </w:tcMar>
+            <w:vAlign w:val="center"/>
+          </w:tcPr>
+          <w:p>
+            <w:pPr>
+              <w:pStyle w:val="Normal"/>
+              <w:jc w:val="left"/>
+              <w:pBdr>
+                <w:bottom w:val="none" w:sz="0" w:space="0" w:color="000000"/>
+                <w:top w:val="none" w:sz="0" w:space="0" w:color="000000"/>
+                <w:left w:val="none" w:sz="0" w:space="0" w:color="000000"/>
+                <w:right w:val="none" w:sz="0" w:space="0" w:color="000000"/>
+              </w:pBdr>
+              <w:spacing w:after="100" w:before="100" w:line="240"/>
+              <w:ind w:left="100" w:right="100" w:firstLine="0" w:firstLineChars="0"/>
+              <w:rPr>
+                <w:rFonts w:ascii="Helvetica" w:hAnsi="Helvetica" w:eastAsia="Helvetica" w:cs="Helvetica"/>
+                <w:i w:val="false"/>
+                <w:b w:val="false"/>
+                <w:u w:val="none"/>
+                <w:strike w:val="false"/>
+                <w:sz w:val="22"/>
+                <w:szCs w:val="22"/>
+                <w:color w:val="000000"/>
+              </w:rPr>
+            </w:pPr>
+            <w:r>
+              <w:rPr>
+                <w:rFonts w:ascii="Helvetica" w:hAnsi="Helvetica" w:eastAsia="Helvetica" w:cs="Helvetica"/>
+                <w:i w:val="false"/>
+                <w:b w:val="false"/>
+                <w:u w:val="none"/>
+                <w:strike w:val="false"/>
+                <w:sz w:val="22"/>
+                <w:szCs w:val="22"/>
+                <w:color w:val="000000"/>
+              </w:rPr>
+              <w:t xml:space="preserve">&lt;0.001</w:t>
             </w:r>
           </w:p>
         </w:tc>
@@ -4981,7 +5642,7 @@
                 <w:szCs w:val="22"/>
                 <w:color w:val="000000"/>
               </w:rPr>
-              <w:t xml:space="preserve">16.0</w:t>
+              <w:t xml:space="preserve">28</w:t>
             </w:r>
           </w:p>
         </w:tc>
@@ -5036,7 +5697,62 @@
                 <w:szCs w:val="22"/>
                 <w:color w:val="000000"/>
               </w:rPr>
-              <w:t xml:space="preserve">0.0000</w:t>
+              <w:t xml:space="preserve">0</w:t>
+            </w:r>
+          </w:p>
+        </w:tc>
+        <w:tc>
+          <w:tcPr>
+            <w:tcBorders>
+              <w:bottom w:val="none" w:sz="0" w:space="0" w:color="000000"/>
+              <w:top w:val="none" w:sz="0" w:space="0" w:color="000000"/>
+              <w:left w:val="none" w:sz="0" w:space="0" w:color="000000"/>
+              <w:right w:val="none" w:sz="0" w:space="0" w:color="000000"/>
+            </w:tcBorders>
+            <w:shd w:val="clear" w:color="auto" w:fill="FFFFFF"/>
+            <w:tcMar>
+              <w:top w:w="0" w:type="dxa"/>
+              <w:bottom w:w="0" w:type="dxa"/>
+              <w:left w:w="0" w:type="dxa"/>
+              <w:right w:w="0" w:type="dxa"/>
+            </w:tcMar>
+            <w:vAlign w:val="center"/>
+          </w:tcPr>
+          <w:p>
+            <w:pPr>
+              <w:pStyle w:val="Normal"/>
+              <w:jc w:val="left"/>
+              <w:pBdr>
+                <w:bottom w:val="none" w:sz="0" w:space="0" w:color="000000"/>
+                <w:top w:val="none" w:sz="0" w:space="0" w:color="000000"/>
+                <w:left w:val="none" w:sz="0" w:space="0" w:color="000000"/>
+                <w:right w:val="none" w:sz="0" w:space="0" w:color="000000"/>
+              </w:pBdr>
+              <w:spacing w:after="100" w:before="100" w:line="240"/>
+              <w:ind w:left="100" w:right="100" w:firstLine="0" w:firstLineChars="0"/>
+              <w:rPr>
+                <w:rFonts w:ascii="Helvetica" w:hAnsi="Helvetica" w:eastAsia="Helvetica" w:cs="Helvetica"/>
+                <w:i w:val="false"/>
+                <w:b w:val="false"/>
+                <w:u w:val="none"/>
+                <w:strike w:val="false"/>
+                <w:sz w:val="22"/>
+                <w:szCs w:val="22"/>
+                <w:color w:val="000000"/>
+              </w:rPr>
+            </w:pPr>
+            <w:r>
+              <w:rPr>
+                <w:rFonts w:ascii="Helvetica" w:hAnsi="Helvetica" w:eastAsia="Helvetica" w:cs="Helvetica"/>
+                <w:i w:val="false"/>
+                <w:b w:val="false"/>
+                <w:u w:val="none"/>
+                <w:strike w:val="false"/>
+                <w:sz w:val="22"/>
+                <w:szCs w:val="22"/>
+                <w:color w:val="000000"/>
+              </w:rPr>
+              <w:t xml:space="preserve">&lt;0.001</w:t>
             </w:r>
           </w:p>
         </w:tc>
@@ -5371,7 +6087,7 @@
                 <w:szCs w:val="22"/>
                 <w:color w:val="000000"/>
               </w:rPr>
-              <w:t xml:space="preserve">498.0</w:t>
+              <w:t xml:space="preserve">28</w:t>
             </w:r>
           </w:p>
         </w:tc>
@@ -5426,62 +6142,117 @@
                 <w:szCs w:val="22"/>
                 <w:color w:val="000000"/>
               </w:rPr>
-              <w:t xml:space="preserve">0.0838</w:t>
-            </w:r>
-          </w:p>
-        </w:tc>
-        <w:tc>
-          <w:tcPr>
-            <w:tcBorders>
-              <w:bottom w:val="none" w:sz="0" w:space="0" w:color="000000"/>
-              <w:top w:val="none" w:sz="0" w:space="0" w:color="000000"/>
-              <w:left w:val="none" w:sz="0" w:space="0" w:color="000000"/>
-              <w:right w:val="none" w:sz="0" w:space="0" w:color="000000"/>
-            </w:tcBorders>
-            <w:shd w:val="clear" w:color="auto" w:fill="FFFFFF"/>
-            <w:tcMar>
-              <w:top w:w="0" w:type="dxa"/>
-              <w:bottom w:w="0" w:type="dxa"/>
-              <w:left w:w="0" w:type="dxa"/>
-              <w:right w:w="0" w:type="dxa"/>
-            </w:tcMar>
-            <w:vAlign w:val="center"/>
-          </w:tcPr>
-          <w:p>
-            <w:pPr>
-              <w:pStyle w:val="Normal"/>
-              <w:jc w:val="left"/>
-              <w:pBdr>
-                <w:bottom w:val="none" w:sz="0" w:space="0" w:color="000000"/>
-                <w:top w:val="none" w:sz="0" w:space="0" w:color="000000"/>
-                <w:left w:val="none" w:sz="0" w:space="0" w:color="000000"/>
-                <w:right w:val="none" w:sz="0" w:space="0" w:color="000000"/>
-              </w:pBdr>
-              <w:spacing w:after="100" w:before="100" w:line="240"/>
-              <w:ind w:left="100" w:right="100" w:firstLine="0" w:firstLineChars="0"/>
-              <w:rPr>
-                <w:rFonts w:ascii="Helvetica" w:hAnsi="Helvetica" w:eastAsia="Helvetica" w:cs="Helvetica"/>
-                <w:i w:val="false"/>
-                <w:b w:val="false"/>
-                <w:u w:val="none"/>
-                <w:strike w:val="false"/>
-                <w:sz w:val="22"/>
-                <w:szCs w:val="22"/>
-                <w:color w:val="000000"/>
-              </w:rPr>
-            </w:pPr>
-            <w:r>
-              <w:rPr>
-                <w:rFonts w:ascii="Helvetica" w:hAnsi="Helvetica" w:eastAsia="Helvetica" w:cs="Helvetica"/>
-                <w:i w:val="false"/>
-                <w:b w:val="false"/>
-                <w:u w:val="none"/>
-                <w:strike w:val="false"/>
-                <w:sz w:val="22"/>
-                <w:szCs w:val="22"/>
-                <w:color w:val="000000"/>
-              </w:rPr>
-              <w:t xml:space="preserve">ns</w:t>
+              <w:t xml:space="preserve">386</w:t>
+            </w:r>
+          </w:p>
+        </w:tc>
+        <w:tc>
+          <w:tcPr>
+            <w:tcBorders>
+              <w:bottom w:val="none" w:sz="0" w:space="0" w:color="000000"/>
+              <w:top w:val="none" w:sz="0" w:space="0" w:color="000000"/>
+              <w:left w:val="none" w:sz="0" w:space="0" w:color="000000"/>
+              <w:right w:val="none" w:sz="0" w:space="0" w:color="000000"/>
+            </w:tcBorders>
+            <w:shd w:val="clear" w:color="auto" w:fill="FFFFFF"/>
+            <w:tcMar>
+              <w:top w:w="0" w:type="dxa"/>
+              <w:bottom w:w="0" w:type="dxa"/>
+              <w:left w:w="0" w:type="dxa"/>
+              <w:right w:w="0" w:type="dxa"/>
+            </w:tcMar>
+            <w:vAlign w:val="center"/>
+          </w:tcPr>
+          <w:p>
+            <w:pPr>
+              <w:pStyle w:val="Normal"/>
+              <w:jc w:val="left"/>
+              <w:pBdr>
+                <w:bottom w:val="none" w:sz="0" w:space="0" w:color="000000"/>
+                <w:top w:val="none" w:sz="0" w:space="0" w:color="000000"/>
+                <w:left w:val="none" w:sz="0" w:space="0" w:color="000000"/>
+                <w:right w:val="none" w:sz="0" w:space="0" w:color="000000"/>
+              </w:pBdr>
+              <w:spacing w:after="100" w:before="100" w:line="240"/>
+              <w:ind w:left="100" w:right="100" w:firstLine="0" w:firstLineChars="0"/>
+              <w:rPr>
+                <w:rFonts w:ascii="Helvetica" w:hAnsi="Helvetica" w:eastAsia="Helvetica" w:cs="Helvetica"/>
+                <w:i w:val="false"/>
+                <w:b w:val="false"/>
+                <w:u w:val="none"/>
+                <w:strike w:val="false"/>
+                <w:sz w:val="22"/>
+                <w:szCs w:val="22"/>
+                <w:color w:val="000000"/>
+              </w:rPr>
+            </w:pPr>
+            <w:r>
+              <w:rPr>
+                <w:rFonts w:ascii="Helvetica" w:hAnsi="Helvetica" w:eastAsia="Helvetica" w:cs="Helvetica"/>
+                <w:i w:val="false"/>
+                <w:b w:val="false"/>
+                <w:u w:val="none"/>
+                <w:strike w:val="false"/>
+                <w:sz w:val="22"/>
+                <w:szCs w:val="22"/>
+                <w:color w:val="000000"/>
+              </w:rPr>
+              <w:t xml:space="preserve">&lt;0.001</w:t>
+            </w:r>
+          </w:p>
+        </w:tc>
+        <w:tc>
+          <w:tcPr>
+            <w:tcBorders>
+              <w:bottom w:val="none" w:sz="0" w:space="0" w:color="000000"/>
+              <w:top w:val="none" w:sz="0" w:space="0" w:color="000000"/>
+              <w:left w:val="none" w:sz="0" w:space="0" w:color="000000"/>
+              <w:right w:val="none" w:sz="0" w:space="0" w:color="000000"/>
+            </w:tcBorders>
+            <w:shd w:val="clear" w:color="auto" w:fill="FFFFFF"/>
+            <w:tcMar>
+              <w:top w:w="0" w:type="dxa"/>
+              <w:bottom w:w="0" w:type="dxa"/>
+              <w:left w:w="0" w:type="dxa"/>
+              <w:right w:w="0" w:type="dxa"/>
+            </w:tcMar>
+            <w:vAlign w:val="center"/>
+          </w:tcPr>
+          <w:p>
+            <w:pPr>
+              <w:pStyle w:val="Normal"/>
+              <w:jc w:val="left"/>
+              <w:pBdr>
+                <w:bottom w:val="none" w:sz="0" w:space="0" w:color="000000"/>
+                <w:top w:val="none" w:sz="0" w:space="0" w:color="000000"/>
+                <w:left w:val="none" w:sz="0" w:space="0" w:color="000000"/>
+                <w:right w:val="none" w:sz="0" w:space="0" w:color="000000"/>
+              </w:pBdr>
+              <w:spacing w:after="100" w:before="100" w:line="240"/>
+              <w:ind w:left="100" w:right="100" w:firstLine="0" w:firstLineChars="0"/>
+              <w:rPr>
+                <w:rFonts w:ascii="Helvetica" w:hAnsi="Helvetica" w:eastAsia="Helvetica" w:cs="Helvetica"/>
+                <w:i w:val="false"/>
+                <w:b w:val="false"/>
+                <w:u w:val="none"/>
+                <w:strike w:val="false"/>
+                <w:sz w:val="22"/>
+                <w:szCs w:val="22"/>
+                <w:color w:val="000000"/>
+              </w:rPr>
+            </w:pPr>
+            <w:r>
+              <w:rPr>
+                <w:rFonts w:ascii="Helvetica" w:hAnsi="Helvetica" w:eastAsia="Helvetica" w:cs="Helvetica"/>
+                <w:i w:val="false"/>
+                <w:b w:val="false"/>
+                <w:u w:val="none"/>
+                <w:strike w:val="false"/>
+                <w:sz w:val="22"/>
+                <w:szCs w:val="22"/>
+                <w:color w:val="000000"/>
+              </w:rPr>
+              <w:t xml:space="preserve">***</w:t>
             </w:r>
           </w:p>
         </w:tc>
@@ -5761,7 +6532,7 @@
                 <w:szCs w:val="22"/>
                 <w:color w:val="000000"/>
               </w:rPr>
-              <w:t xml:space="preserve">10.0</w:t>
+              <w:t xml:space="preserve">28</w:t>
             </w:r>
           </w:p>
         </w:tc>
@@ -5816,7 +6587,62 @@
                 <w:szCs w:val="22"/>
                 <w:color w:val="000000"/>
               </w:rPr>
-              <w:t xml:space="preserve">0.0000</w:t>
+              <w:t xml:space="preserve">0</w:t>
+            </w:r>
+          </w:p>
+        </w:tc>
+        <w:tc>
+          <w:tcPr>
+            <w:tcBorders>
+              <w:bottom w:val="none" w:sz="0" w:space="0" w:color="000000"/>
+              <w:top w:val="none" w:sz="0" w:space="0" w:color="000000"/>
+              <w:left w:val="none" w:sz="0" w:space="0" w:color="000000"/>
+              <w:right w:val="none" w:sz="0" w:space="0" w:color="000000"/>
+            </w:tcBorders>
+            <w:shd w:val="clear" w:color="auto" w:fill="FFFFFF"/>
+            <w:tcMar>
+              <w:top w:w="0" w:type="dxa"/>
+              <w:bottom w:w="0" w:type="dxa"/>
+              <w:left w:w="0" w:type="dxa"/>
+              <w:right w:w="0" w:type="dxa"/>
+            </w:tcMar>
+            <w:vAlign w:val="center"/>
+          </w:tcPr>
+          <w:p>
+            <w:pPr>
+              <w:pStyle w:val="Normal"/>
+              <w:jc w:val="left"/>
+              <w:pBdr>
+                <w:bottom w:val="none" w:sz="0" w:space="0" w:color="000000"/>
+                <w:top w:val="none" w:sz="0" w:space="0" w:color="000000"/>
+                <w:left w:val="none" w:sz="0" w:space="0" w:color="000000"/>
+                <w:right w:val="none" w:sz="0" w:space="0" w:color="000000"/>
+              </w:pBdr>
+              <w:spacing w:after="100" w:before="100" w:line="240"/>
+              <w:ind w:left="100" w:right="100" w:firstLine="0" w:firstLineChars="0"/>
+              <w:rPr>
+                <w:rFonts w:ascii="Helvetica" w:hAnsi="Helvetica" w:eastAsia="Helvetica" w:cs="Helvetica"/>
+                <w:i w:val="false"/>
+                <w:b w:val="false"/>
+                <w:u w:val="none"/>
+                <w:strike w:val="false"/>
+                <w:sz w:val="22"/>
+                <w:szCs w:val="22"/>
+                <w:color w:val="000000"/>
+              </w:rPr>
+            </w:pPr>
+            <w:r>
+              <w:rPr>
+                <w:rFonts w:ascii="Helvetica" w:hAnsi="Helvetica" w:eastAsia="Helvetica" w:cs="Helvetica"/>
+                <w:i w:val="false"/>
+                <w:b w:val="false"/>
+                <w:u w:val="none"/>
+                <w:strike w:val="false"/>
+                <w:sz w:val="22"/>
+                <w:szCs w:val="22"/>
+                <w:color w:val="000000"/>
+              </w:rPr>
+              <w:t xml:space="preserve">&lt;0.001</w:t>
             </w:r>
           </w:p>
         </w:tc>
@@ -6151,7 +6977,7 @@
                 <w:szCs w:val="22"/>
                 <w:color w:val="000000"/>
               </w:rPr>
-              <w:t xml:space="preserve">5.0</w:t>
+              <w:t xml:space="preserve">28</w:t>
             </w:r>
           </w:p>
         </w:tc>
@@ -6206,7 +7032,62 @@
                 <w:szCs w:val="22"/>
                 <w:color w:val="000000"/>
               </w:rPr>
-              <w:t xml:space="preserve">0.0000</w:t>
+              <w:t xml:space="preserve">0</w:t>
+            </w:r>
+          </w:p>
+        </w:tc>
+        <w:tc>
+          <w:tcPr>
+            <w:tcBorders>
+              <w:bottom w:val="none" w:sz="0" w:space="0" w:color="000000"/>
+              <w:top w:val="none" w:sz="0" w:space="0" w:color="000000"/>
+              <w:left w:val="none" w:sz="0" w:space="0" w:color="000000"/>
+              <w:right w:val="none" w:sz="0" w:space="0" w:color="000000"/>
+            </w:tcBorders>
+            <w:shd w:val="clear" w:color="auto" w:fill="FFFFFF"/>
+            <w:tcMar>
+              <w:top w:w="0" w:type="dxa"/>
+              <w:bottom w:w="0" w:type="dxa"/>
+              <w:left w:w="0" w:type="dxa"/>
+              <w:right w:w="0" w:type="dxa"/>
+            </w:tcMar>
+            <w:vAlign w:val="center"/>
+          </w:tcPr>
+          <w:p>
+            <w:pPr>
+              <w:pStyle w:val="Normal"/>
+              <w:jc w:val="left"/>
+              <w:pBdr>
+                <w:bottom w:val="none" w:sz="0" w:space="0" w:color="000000"/>
+                <w:top w:val="none" w:sz="0" w:space="0" w:color="000000"/>
+                <w:left w:val="none" w:sz="0" w:space="0" w:color="000000"/>
+                <w:right w:val="none" w:sz="0" w:space="0" w:color="000000"/>
+              </w:pBdr>
+              <w:spacing w:after="100" w:before="100" w:line="240"/>
+              <w:ind w:left="100" w:right="100" w:firstLine="0" w:firstLineChars="0"/>
+              <w:rPr>
+                <w:rFonts w:ascii="Helvetica" w:hAnsi="Helvetica" w:eastAsia="Helvetica" w:cs="Helvetica"/>
+                <w:i w:val="false"/>
+                <w:b w:val="false"/>
+                <w:u w:val="none"/>
+                <w:strike w:val="false"/>
+                <w:sz w:val="22"/>
+                <w:szCs w:val="22"/>
+                <w:color w:val="000000"/>
+              </w:rPr>
+            </w:pPr>
+            <w:r>
+              <w:rPr>
+                <w:rFonts w:ascii="Helvetica" w:hAnsi="Helvetica" w:eastAsia="Helvetica" w:cs="Helvetica"/>
+                <w:i w:val="false"/>
+                <w:b w:val="false"/>
+                <w:u w:val="none"/>
+                <w:strike w:val="false"/>
+                <w:sz w:val="22"/>
+                <w:szCs w:val="22"/>
+                <w:color w:val="000000"/>
+              </w:rPr>
+              <w:t xml:space="preserve">&lt;0.001</w:t>
             </w:r>
           </w:p>
         </w:tc>
@@ -6541,7 +7422,7 @@
                 <w:szCs w:val="22"/>
                 <w:color w:val="000000"/>
               </w:rPr>
-              <w:t xml:space="preserve">488.0</w:t>
+              <w:t xml:space="preserve">28</w:t>
             </w:r>
           </w:p>
         </w:tc>
@@ -6596,62 +7477,117 @@
                 <w:szCs w:val="22"/>
                 <w:color w:val="000000"/>
               </w:rPr>
-              <w:t xml:space="preserve">0.1176</w:t>
-            </w:r>
-          </w:p>
-        </w:tc>
-        <w:tc>
-          <w:tcPr>
-            <w:tcBorders>
-              <w:bottom w:val="none" w:sz="0" w:space="0" w:color="000000"/>
-              <w:top w:val="none" w:sz="0" w:space="0" w:color="000000"/>
-              <w:left w:val="none" w:sz="0" w:space="0" w:color="000000"/>
-              <w:right w:val="none" w:sz="0" w:space="0" w:color="000000"/>
-            </w:tcBorders>
-            <w:shd w:val="clear" w:color="auto" w:fill="FFFFFF"/>
-            <w:tcMar>
-              <w:top w:w="0" w:type="dxa"/>
-              <w:bottom w:w="0" w:type="dxa"/>
-              <w:left w:w="0" w:type="dxa"/>
-              <w:right w:w="0" w:type="dxa"/>
-            </w:tcMar>
-            <w:vAlign w:val="center"/>
-          </w:tcPr>
-          <w:p>
-            <w:pPr>
-              <w:pStyle w:val="Normal"/>
-              <w:jc w:val="left"/>
-              <w:pBdr>
-                <w:bottom w:val="none" w:sz="0" w:space="0" w:color="000000"/>
-                <w:top w:val="none" w:sz="0" w:space="0" w:color="000000"/>
-                <w:left w:val="none" w:sz="0" w:space="0" w:color="000000"/>
-                <w:right w:val="none" w:sz="0" w:space="0" w:color="000000"/>
-              </w:pBdr>
-              <w:spacing w:after="100" w:before="100" w:line="240"/>
-              <w:ind w:left="100" w:right="100" w:firstLine="0" w:firstLineChars="0"/>
-              <w:rPr>
-                <w:rFonts w:ascii="Helvetica" w:hAnsi="Helvetica" w:eastAsia="Helvetica" w:cs="Helvetica"/>
-                <w:i w:val="false"/>
-                <w:b w:val="false"/>
-                <w:u w:val="none"/>
-                <w:strike w:val="false"/>
-                <w:sz w:val="22"/>
-                <w:szCs w:val="22"/>
-                <w:color w:val="000000"/>
-              </w:rPr>
-            </w:pPr>
-            <w:r>
-              <w:rPr>
-                <w:rFonts w:ascii="Helvetica" w:hAnsi="Helvetica" w:eastAsia="Helvetica" w:cs="Helvetica"/>
-                <w:i w:val="false"/>
-                <w:b w:val="false"/>
-                <w:u w:val="none"/>
-                <w:strike w:val="false"/>
-                <w:sz w:val="22"/>
-                <w:szCs w:val="22"/>
-                <w:color w:val="000000"/>
-              </w:rPr>
-              <w:t xml:space="preserve">ns</w:t>
+              <w:t xml:space="preserve">400</w:t>
+            </w:r>
+          </w:p>
+        </w:tc>
+        <w:tc>
+          <w:tcPr>
+            <w:tcBorders>
+              <w:bottom w:val="none" w:sz="0" w:space="0" w:color="000000"/>
+              <w:top w:val="none" w:sz="0" w:space="0" w:color="000000"/>
+              <w:left w:val="none" w:sz="0" w:space="0" w:color="000000"/>
+              <w:right w:val="none" w:sz="0" w:space="0" w:color="000000"/>
+            </w:tcBorders>
+            <w:shd w:val="clear" w:color="auto" w:fill="FFFFFF"/>
+            <w:tcMar>
+              <w:top w:w="0" w:type="dxa"/>
+              <w:bottom w:w="0" w:type="dxa"/>
+              <w:left w:w="0" w:type="dxa"/>
+              <w:right w:w="0" w:type="dxa"/>
+            </w:tcMar>
+            <w:vAlign w:val="center"/>
+          </w:tcPr>
+          <w:p>
+            <w:pPr>
+              <w:pStyle w:val="Normal"/>
+              <w:jc w:val="left"/>
+              <w:pBdr>
+                <w:bottom w:val="none" w:sz="0" w:space="0" w:color="000000"/>
+                <w:top w:val="none" w:sz="0" w:space="0" w:color="000000"/>
+                <w:left w:val="none" w:sz="0" w:space="0" w:color="000000"/>
+                <w:right w:val="none" w:sz="0" w:space="0" w:color="000000"/>
+              </w:pBdr>
+              <w:spacing w:after="100" w:before="100" w:line="240"/>
+              <w:ind w:left="100" w:right="100" w:firstLine="0" w:firstLineChars="0"/>
+              <w:rPr>
+                <w:rFonts w:ascii="Helvetica" w:hAnsi="Helvetica" w:eastAsia="Helvetica" w:cs="Helvetica"/>
+                <w:i w:val="false"/>
+                <w:b w:val="false"/>
+                <w:u w:val="none"/>
+                <w:strike w:val="false"/>
+                <w:sz w:val="22"/>
+                <w:szCs w:val="22"/>
+                <w:color w:val="000000"/>
+              </w:rPr>
+            </w:pPr>
+            <w:r>
+              <w:rPr>
+                <w:rFonts w:ascii="Helvetica" w:hAnsi="Helvetica" w:eastAsia="Helvetica" w:cs="Helvetica"/>
+                <w:i w:val="false"/>
+                <w:b w:val="false"/>
+                <w:u w:val="none"/>
+                <w:strike w:val="false"/>
+                <w:sz w:val="22"/>
+                <w:szCs w:val="22"/>
+                <w:color w:val="000000"/>
+              </w:rPr>
+              <w:t xml:space="preserve">&lt;0.001</w:t>
+            </w:r>
+          </w:p>
+        </w:tc>
+        <w:tc>
+          <w:tcPr>
+            <w:tcBorders>
+              <w:bottom w:val="none" w:sz="0" w:space="0" w:color="000000"/>
+              <w:top w:val="none" w:sz="0" w:space="0" w:color="000000"/>
+              <w:left w:val="none" w:sz="0" w:space="0" w:color="000000"/>
+              <w:right w:val="none" w:sz="0" w:space="0" w:color="000000"/>
+            </w:tcBorders>
+            <w:shd w:val="clear" w:color="auto" w:fill="FFFFFF"/>
+            <w:tcMar>
+              <w:top w:w="0" w:type="dxa"/>
+              <w:bottom w:w="0" w:type="dxa"/>
+              <w:left w:w="0" w:type="dxa"/>
+              <w:right w:w="0" w:type="dxa"/>
+            </w:tcMar>
+            <w:vAlign w:val="center"/>
+          </w:tcPr>
+          <w:p>
+            <w:pPr>
+              <w:pStyle w:val="Normal"/>
+              <w:jc w:val="left"/>
+              <w:pBdr>
+                <w:bottom w:val="none" w:sz="0" w:space="0" w:color="000000"/>
+                <w:top w:val="none" w:sz="0" w:space="0" w:color="000000"/>
+                <w:left w:val="none" w:sz="0" w:space="0" w:color="000000"/>
+                <w:right w:val="none" w:sz="0" w:space="0" w:color="000000"/>
+              </w:pBdr>
+              <w:spacing w:after="100" w:before="100" w:line="240"/>
+              <w:ind w:left="100" w:right="100" w:firstLine="0" w:firstLineChars="0"/>
+              <w:rPr>
+                <w:rFonts w:ascii="Helvetica" w:hAnsi="Helvetica" w:eastAsia="Helvetica" w:cs="Helvetica"/>
+                <w:i w:val="false"/>
+                <w:b w:val="false"/>
+                <w:u w:val="none"/>
+                <w:strike w:val="false"/>
+                <w:sz w:val="22"/>
+                <w:szCs w:val="22"/>
+                <w:color w:val="000000"/>
+              </w:rPr>
+            </w:pPr>
+            <w:r>
+              <w:rPr>
+                <w:rFonts w:ascii="Helvetica" w:hAnsi="Helvetica" w:eastAsia="Helvetica" w:cs="Helvetica"/>
+                <w:i w:val="false"/>
+                <w:b w:val="false"/>
+                <w:u w:val="none"/>
+                <w:strike w:val="false"/>
+                <w:sz w:val="22"/>
+                <w:szCs w:val="22"/>
+                <w:color w:val="000000"/>
+              </w:rPr>
+              <w:t xml:space="preserve">***</w:t>
             </w:r>
           </w:p>
         </w:tc>
@@ -6931,7 +7867,7 @@
                 <w:szCs w:val="22"/>
                 <w:color w:val="000000"/>
               </w:rPr>
-              <w:t xml:space="preserve">4.0</w:t>
+              <w:t xml:space="preserve">28</w:t>
             </w:r>
           </w:p>
         </w:tc>
@@ -6986,7 +7922,62 @@
                 <w:szCs w:val="22"/>
                 <w:color w:val="000000"/>
               </w:rPr>
-              <w:t xml:space="preserve">0.0000</w:t>
+              <w:t xml:space="preserve">0</w:t>
+            </w:r>
+          </w:p>
+        </w:tc>
+        <w:tc>
+          <w:tcPr>
+            <w:tcBorders>
+              <w:bottom w:val="none" w:sz="0" w:space="0" w:color="000000"/>
+              <w:top w:val="none" w:sz="0" w:space="0" w:color="000000"/>
+              <w:left w:val="none" w:sz="0" w:space="0" w:color="000000"/>
+              <w:right w:val="none" w:sz="0" w:space="0" w:color="000000"/>
+            </w:tcBorders>
+            <w:shd w:val="clear" w:color="auto" w:fill="FFFFFF"/>
+            <w:tcMar>
+              <w:top w:w="0" w:type="dxa"/>
+              <w:bottom w:w="0" w:type="dxa"/>
+              <w:left w:w="0" w:type="dxa"/>
+              <w:right w:w="0" w:type="dxa"/>
+            </w:tcMar>
+            <w:vAlign w:val="center"/>
+          </w:tcPr>
+          <w:p>
+            <w:pPr>
+              <w:pStyle w:val="Normal"/>
+              <w:jc w:val="left"/>
+              <w:pBdr>
+                <w:bottom w:val="none" w:sz="0" w:space="0" w:color="000000"/>
+                <w:top w:val="none" w:sz="0" w:space="0" w:color="000000"/>
+                <w:left w:val="none" w:sz="0" w:space="0" w:color="000000"/>
+                <w:right w:val="none" w:sz="0" w:space="0" w:color="000000"/>
+              </w:pBdr>
+              <w:spacing w:after="100" w:before="100" w:line="240"/>
+              <w:ind w:left="100" w:right="100" w:firstLine="0" w:firstLineChars="0"/>
+              <w:rPr>
+                <w:rFonts w:ascii="Helvetica" w:hAnsi="Helvetica" w:eastAsia="Helvetica" w:cs="Helvetica"/>
+                <w:i w:val="false"/>
+                <w:b w:val="false"/>
+                <w:u w:val="none"/>
+                <w:strike w:val="false"/>
+                <w:sz w:val="22"/>
+                <w:szCs w:val="22"/>
+                <w:color w:val="000000"/>
+              </w:rPr>
+            </w:pPr>
+            <w:r>
+              <w:rPr>
+                <w:rFonts w:ascii="Helvetica" w:hAnsi="Helvetica" w:eastAsia="Helvetica" w:cs="Helvetica"/>
+                <w:i w:val="false"/>
+                <w:b w:val="false"/>
+                <w:u w:val="none"/>
+                <w:strike w:val="false"/>
+                <w:sz w:val="22"/>
+                <w:szCs w:val="22"/>
+                <w:color w:val="000000"/>
+              </w:rPr>
+              <w:t xml:space="preserve">&lt;0.001</w:t>
             </w:r>
           </w:p>
         </w:tc>
@@ -7321,7 +8312,7 @@
                 <w:szCs w:val="22"/>
                 <w:color w:val="000000"/>
               </w:rPr>
-              <w:t xml:space="preserve">3.0</w:t>
+              <w:t xml:space="preserve">28</w:t>
             </w:r>
           </w:p>
         </w:tc>
@@ -7376,7 +8367,62 @@
                 <w:szCs w:val="22"/>
                 <w:color w:val="000000"/>
               </w:rPr>
-              <w:t xml:space="preserve">0.0000</w:t>
+              <w:t xml:space="preserve">0</w:t>
+            </w:r>
+          </w:p>
+        </w:tc>
+        <w:tc>
+          <w:tcPr>
+            <w:tcBorders>
+              <w:bottom w:val="none" w:sz="0" w:space="0" w:color="000000"/>
+              <w:top w:val="none" w:sz="0" w:space="0" w:color="000000"/>
+              <w:left w:val="none" w:sz="0" w:space="0" w:color="000000"/>
+              <w:right w:val="none" w:sz="0" w:space="0" w:color="000000"/>
+            </w:tcBorders>
+            <w:shd w:val="clear" w:color="auto" w:fill="FFFFFF"/>
+            <w:tcMar>
+              <w:top w:w="0" w:type="dxa"/>
+              <w:bottom w:w="0" w:type="dxa"/>
+              <w:left w:w="0" w:type="dxa"/>
+              <w:right w:w="0" w:type="dxa"/>
+            </w:tcMar>
+            <w:vAlign w:val="center"/>
+          </w:tcPr>
+          <w:p>
+            <w:pPr>
+              <w:pStyle w:val="Normal"/>
+              <w:jc w:val="left"/>
+              <w:pBdr>
+                <w:bottom w:val="none" w:sz="0" w:space="0" w:color="000000"/>
+                <w:top w:val="none" w:sz="0" w:space="0" w:color="000000"/>
+                <w:left w:val="none" w:sz="0" w:space="0" w:color="000000"/>
+                <w:right w:val="none" w:sz="0" w:space="0" w:color="000000"/>
+              </w:pBdr>
+              <w:spacing w:after="100" w:before="100" w:line="240"/>
+              <w:ind w:left="100" w:right="100" w:firstLine="0" w:firstLineChars="0"/>
+              <w:rPr>
+                <w:rFonts w:ascii="Helvetica" w:hAnsi="Helvetica" w:eastAsia="Helvetica" w:cs="Helvetica"/>
+                <w:i w:val="false"/>
+                <w:b w:val="false"/>
+                <w:u w:val="none"/>
+                <w:strike w:val="false"/>
+                <w:sz w:val="22"/>
+                <w:szCs w:val="22"/>
+                <w:color w:val="000000"/>
+              </w:rPr>
+            </w:pPr>
+            <w:r>
+              <w:rPr>
+                <w:rFonts w:ascii="Helvetica" w:hAnsi="Helvetica" w:eastAsia="Helvetica" w:cs="Helvetica"/>
+                <w:i w:val="false"/>
+                <w:b w:val="false"/>
+                <w:u w:val="none"/>
+                <w:strike w:val="false"/>
+                <w:sz w:val="22"/>
+                <w:szCs w:val="22"/>
+                <w:color w:val="000000"/>
+              </w:rPr>
+              <w:t xml:space="preserve">&lt;0.001</w:t>
             </w:r>
           </w:p>
         </w:tc>
@@ -7711,7 +8757,7 @@
                 <w:szCs w:val="22"/>
                 <w:color w:val="000000"/>
               </w:rPr>
-              <w:t xml:space="preserve">774.0</w:t>
+              <w:t xml:space="preserve">28</w:t>
             </w:r>
           </w:p>
         </w:tc>
@@ -7766,7 +8812,62 @@
                 <w:szCs w:val="22"/>
                 <w:color w:val="000000"/>
               </w:rPr>
-              <w:t xml:space="preserve">0.0000</w:t>
+              <w:t xml:space="preserve">406</w:t>
+            </w:r>
+          </w:p>
+        </w:tc>
+        <w:tc>
+          <w:tcPr>
+            <w:tcBorders>
+              <w:bottom w:val="none" w:sz="0" w:space="0" w:color="000000"/>
+              <w:top w:val="none" w:sz="0" w:space="0" w:color="000000"/>
+              <w:left w:val="none" w:sz="0" w:space="0" w:color="000000"/>
+              <w:right w:val="none" w:sz="0" w:space="0" w:color="000000"/>
+            </w:tcBorders>
+            <w:shd w:val="clear" w:color="auto" w:fill="FFFFFF"/>
+            <w:tcMar>
+              <w:top w:w="0" w:type="dxa"/>
+              <w:bottom w:w="0" w:type="dxa"/>
+              <w:left w:w="0" w:type="dxa"/>
+              <w:right w:w="0" w:type="dxa"/>
+            </w:tcMar>
+            <w:vAlign w:val="center"/>
+          </w:tcPr>
+          <w:p>
+            <w:pPr>
+              <w:pStyle w:val="Normal"/>
+              <w:jc w:val="left"/>
+              <w:pBdr>
+                <w:bottom w:val="none" w:sz="0" w:space="0" w:color="000000"/>
+                <w:top w:val="none" w:sz="0" w:space="0" w:color="000000"/>
+                <w:left w:val="none" w:sz="0" w:space="0" w:color="000000"/>
+                <w:right w:val="none" w:sz="0" w:space="0" w:color="000000"/>
+              </w:pBdr>
+              <w:spacing w:after="100" w:before="100" w:line="240"/>
+              <w:ind w:left="100" w:right="100" w:firstLine="0" w:firstLineChars="0"/>
+              <w:rPr>
+                <w:rFonts w:ascii="Helvetica" w:hAnsi="Helvetica" w:eastAsia="Helvetica" w:cs="Helvetica"/>
+                <w:i w:val="false"/>
+                <w:b w:val="false"/>
+                <w:u w:val="none"/>
+                <w:strike w:val="false"/>
+                <w:sz w:val="22"/>
+                <w:szCs w:val="22"/>
+                <w:color w:val="000000"/>
+              </w:rPr>
+            </w:pPr>
+            <w:r>
+              <w:rPr>
+                <w:rFonts w:ascii="Helvetica" w:hAnsi="Helvetica" w:eastAsia="Helvetica" w:cs="Helvetica"/>
+                <w:i w:val="false"/>
+                <w:b w:val="false"/>
+                <w:u w:val="none"/>
+                <w:strike w:val="false"/>
+                <w:sz w:val="22"/>
+                <w:szCs w:val="22"/>
+                <w:color w:val="000000"/>
+              </w:rPr>
+              <w:t xml:space="preserve">&lt;0.001</w:t>
             </w:r>
           </w:p>
         </w:tc>
@@ -8101,7 +9202,7 @@
                 <w:szCs w:val="22"/>
                 <w:color w:val="000000"/>
               </w:rPr>
-              <w:t xml:space="preserve">13.0</w:t>
+              <w:t xml:space="preserve">28</w:t>
             </w:r>
           </w:p>
         </w:tc>
@@ -8156,7 +9257,62 @@
                 <w:szCs w:val="22"/>
                 <w:color w:val="000000"/>
               </w:rPr>
-              <w:t xml:space="preserve">0.0000</w:t>
+              <w:t xml:space="preserve">0</w:t>
+            </w:r>
+          </w:p>
+        </w:tc>
+        <w:tc>
+          <w:tcPr>
+            <w:tcBorders>
+              <w:bottom w:val="none" w:sz="0" w:space="0" w:color="000000"/>
+              <w:top w:val="none" w:sz="0" w:space="0" w:color="000000"/>
+              <w:left w:val="none" w:sz="0" w:space="0" w:color="000000"/>
+              <w:right w:val="none" w:sz="0" w:space="0" w:color="000000"/>
+            </w:tcBorders>
+            <w:shd w:val="clear" w:color="auto" w:fill="FFFFFF"/>
+            <w:tcMar>
+              <w:top w:w="0" w:type="dxa"/>
+              <w:bottom w:w="0" w:type="dxa"/>
+              <w:left w:w="0" w:type="dxa"/>
+              <w:right w:w="0" w:type="dxa"/>
+            </w:tcMar>
+            <w:vAlign w:val="center"/>
+          </w:tcPr>
+          <w:p>
+            <w:pPr>
+              <w:pStyle w:val="Normal"/>
+              <w:jc w:val="left"/>
+              <w:pBdr>
+                <w:bottom w:val="none" w:sz="0" w:space="0" w:color="000000"/>
+                <w:top w:val="none" w:sz="0" w:space="0" w:color="000000"/>
+                <w:left w:val="none" w:sz="0" w:space="0" w:color="000000"/>
+                <w:right w:val="none" w:sz="0" w:space="0" w:color="000000"/>
+              </w:pBdr>
+              <w:spacing w:after="100" w:before="100" w:line="240"/>
+              <w:ind w:left="100" w:right="100" w:firstLine="0" w:firstLineChars="0"/>
+              <w:rPr>
+                <w:rFonts w:ascii="Helvetica" w:hAnsi="Helvetica" w:eastAsia="Helvetica" w:cs="Helvetica"/>
+                <w:i w:val="false"/>
+                <w:b w:val="false"/>
+                <w:u w:val="none"/>
+                <w:strike w:val="false"/>
+                <w:sz w:val="22"/>
+                <w:szCs w:val="22"/>
+                <w:color w:val="000000"/>
+              </w:rPr>
+            </w:pPr>
+            <w:r>
+              <w:rPr>
+                <w:rFonts w:ascii="Helvetica" w:hAnsi="Helvetica" w:eastAsia="Helvetica" w:cs="Helvetica"/>
+                <w:i w:val="false"/>
+                <w:b w:val="false"/>
+                <w:u w:val="none"/>
+                <w:strike w:val="false"/>
+                <w:sz w:val="22"/>
+                <w:szCs w:val="22"/>
+                <w:color w:val="000000"/>
+              </w:rPr>
+              <w:t xml:space="preserve">&lt;0.001</w:t>
             </w:r>
           </w:p>
         </w:tc>
@@ -8491,7 +9647,7 @@
                 <w:szCs w:val="22"/>
                 <w:color w:val="000000"/>
               </w:rPr>
-              <w:t xml:space="preserve">0.0</w:t>
+              <w:t xml:space="preserve">28</w:t>
             </w:r>
           </w:p>
         </w:tc>
@@ -8546,7 +9702,62 @@
                 <w:szCs w:val="22"/>
                 <w:color w:val="000000"/>
               </w:rPr>
-              <w:t xml:space="preserve">0.0000</w:t>
+              <w:t xml:space="preserve">0</w:t>
+            </w:r>
+          </w:p>
+        </w:tc>
+        <w:tc>
+          <w:tcPr>
+            <w:tcBorders>
+              <w:bottom w:val="none" w:sz="0" w:space="0" w:color="000000"/>
+              <w:top w:val="none" w:sz="0" w:space="0" w:color="000000"/>
+              <w:left w:val="none" w:sz="0" w:space="0" w:color="000000"/>
+              <w:right w:val="none" w:sz="0" w:space="0" w:color="000000"/>
+            </w:tcBorders>
+            <w:shd w:val="clear" w:color="auto" w:fill="FFFFFF"/>
+            <w:tcMar>
+              <w:top w:w="0" w:type="dxa"/>
+              <w:bottom w:w="0" w:type="dxa"/>
+              <w:left w:w="0" w:type="dxa"/>
+              <w:right w:w="0" w:type="dxa"/>
+            </w:tcMar>
+            <w:vAlign w:val="center"/>
+          </w:tcPr>
+          <w:p>
+            <w:pPr>
+              <w:pStyle w:val="Normal"/>
+              <w:jc w:val="left"/>
+              <w:pBdr>
+                <w:bottom w:val="none" w:sz="0" w:space="0" w:color="000000"/>
+                <w:top w:val="none" w:sz="0" w:space="0" w:color="000000"/>
+                <w:left w:val="none" w:sz="0" w:space="0" w:color="000000"/>
+                <w:right w:val="none" w:sz="0" w:space="0" w:color="000000"/>
+              </w:pBdr>
+              <w:spacing w:after="100" w:before="100" w:line="240"/>
+              <w:ind w:left="100" w:right="100" w:firstLine="0" w:firstLineChars="0"/>
+              <w:rPr>
+                <w:rFonts w:ascii="Helvetica" w:hAnsi="Helvetica" w:eastAsia="Helvetica" w:cs="Helvetica"/>
+                <w:i w:val="false"/>
+                <w:b w:val="false"/>
+                <w:u w:val="none"/>
+                <w:strike w:val="false"/>
+                <w:sz w:val="22"/>
+                <w:szCs w:val="22"/>
+                <w:color w:val="000000"/>
+              </w:rPr>
+            </w:pPr>
+            <w:r>
+              <w:rPr>
+                <w:rFonts w:ascii="Helvetica" w:hAnsi="Helvetica" w:eastAsia="Helvetica" w:cs="Helvetica"/>
+                <w:i w:val="false"/>
+                <w:b w:val="false"/>
+                <w:u w:val="none"/>
+                <w:strike w:val="false"/>
+                <w:sz w:val="22"/>
+                <w:szCs w:val="22"/>
+                <w:color w:val="000000"/>
+              </w:rPr>
+              <w:t xml:space="preserve">&lt;0.001</w:t>
             </w:r>
           </w:p>
         </w:tc>
@@ -8881,7 +10092,7 @@
                 <w:szCs w:val="22"/>
                 <w:color w:val="000000"/>
               </w:rPr>
-              <w:t xml:space="preserve">777.0</w:t>
+              <w:t xml:space="preserve">28</w:t>
             </w:r>
           </w:p>
         </w:tc>
@@ -8936,7 +10147,62 @@
                 <w:szCs w:val="22"/>
                 <w:color w:val="000000"/>
               </w:rPr>
-              <w:t xml:space="preserve">0.0000</w:t>
+              <w:t xml:space="preserve">406</w:t>
+            </w:r>
+          </w:p>
+        </w:tc>
+        <w:tc>
+          <w:tcPr>
+            <w:tcBorders>
+              <w:bottom w:val="none" w:sz="0" w:space="0" w:color="000000"/>
+              <w:top w:val="none" w:sz="0" w:space="0" w:color="000000"/>
+              <w:left w:val="none" w:sz="0" w:space="0" w:color="000000"/>
+              <w:right w:val="none" w:sz="0" w:space="0" w:color="000000"/>
+            </w:tcBorders>
+            <w:shd w:val="clear" w:color="auto" w:fill="FFFFFF"/>
+            <w:tcMar>
+              <w:top w:w="0" w:type="dxa"/>
+              <w:bottom w:w="0" w:type="dxa"/>
+              <w:left w:w="0" w:type="dxa"/>
+              <w:right w:w="0" w:type="dxa"/>
+            </w:tcMar>
+            <w:vAlign w:val="center"/>
+          </w:tcPr>
+          <w:p>
+            <w:pPr>
+              <w:pStyle w:val="Normal"/>
+              <w:jc w:val="left"/>
+              <w:pBdr>
+                <w:bottom w:val="none" w:sz="0" w:space="0" w:color="000000"/>
+                <w:top w:val="none" w:sz="0" w:space="0" w:color="000000"/>
+                <w:left w:val="none" w:sz="0" w:space="0" w:color="000000"/>
+                <w:right w:val="none" w:sz="0" w:space="0" w:color="000000"/>
+              </w:pBdr>
+              <w:spacing w:after="100" w:before="100" w:line="240"/>
+              <w:ind w:left="100" w:right="100" w:firstLine="0" w:firstLineChars="0"/>
+              <w:rPr>
+                <w:rFonts w:ascii="Helvetica" w:hAnsi="Helvetica" w:eastAsia="Helvetica" w:cs="Helvetica"/>
+                <w:i w:val="false"/>
+                <w:b w:val="false"/>
+                <w:u w:val="none"/>
+                <w:strike w:val="false"/>
+                <w:sz w:val="22"/>
+                <w:szCs w:val="22"/>
+                <w:color w:val="000000"/>
+              </w:rPr>
+            </w:pPr>
+            <w:r>
+              <w:rPr>
+                <w:rFonts w:ascii="Helvetica" w:hAnsi="Helvetica" w:eastAsia="Helvetica" w:cs="Helvetica"/>
+                <w:i w:val="false"/>
+                <w:b w:val="false"/>
+                <w:u w:val="none"/>
+                <w:strike w:val="false"/>
+                <w:sz w:val="22"/>
+                <w:szCs w:val="22"/>
+                <w:color w:val="000000"/>
+              </w:rPr>
+              <w:t xml:space="preserve">&lt;0.001</w:t>
             </w:r>
           </w:p>
         </w:tc>
@@ -9271,7 +10537,7 @@
                 <w:szCs w:val="22"/>
                 <w:color w:val="000000"/>
               </w:rPr>
-              <w:t xml:space="preserve">5.0</w:t>
+              <w:t xml:space="preserve">28</w:t>
             </w:r>
           </w:p>
         </w:tc>
@@ -9326,7 +10592,62 @@
                 <w:szCs w:val="22"/>
                 <w:color w:val="000000"/>
               </w:rPr>
-              <w:t xml:space="preserve">0.0000</w:t>
+              <w:t xml:space="preserve">0</w:t>
+            </w:r>
+          </w:p>
+        </w:tc>
+        <w:tc>
+          <w:tcPr>
+            <w:tcBorders>
+              <w:bottom w:val="none" w:sz="0" w:space="0" w:color="000000"/>
+              <w:top w:val="none" w:sz="0" w:space="0" w:color="000000"/>
+              <w:left w:val="none" w:sz="0" w:space="0" w:color="000000"/>
+              <w:right w:val="none" w:sz="0" w:space="0" w:color="000000"/>
+            </w:tcBorders>
+            <w:shd w:val="clear" w:color="auto" w:fill="FFFFFF"/>
+            <w:tcMar>
+              <w:top w:w="0" w:type="dxa"/>
+              <w:bottom w:w="0" w:type="dxa"/>
+              <w:left w:w="0" w:type="dxa"/>
+              <w:right w:w="0" w:type="dxa"/>
+            </w:tcMar>
+            <w:vAlign w:val="center"/>
+          </w:tcPr>
+          <w:p>
+            <w:pPr>
+              <w:pStyle w:val="Normal"/>
+              <w:jc w:val="left"/>
+              <w:pBdr>
+                <w:bottom w:val="none" w:sz="0" w:space="0" w:color="000000"/>
+                <w:top w:val="none" w:sz="0" w:space="0" w:color="000000"/>
+                <w:left w:val="none" w:sz="0" w:space="0" w:color="000000"/>
+                <w:right w:val="none" w:sz="0" w:space="0" w:color="000000"/>
+              </w:pBdr>
+              <w:spacing w:after="100" w:before="100" w:line="240"/>
+              <w:ind w:left="100" w:right="100" w:firstLine="0" w:firstLineChars="0"/>
+              <w:rPr>
+                <w:rFonts w:ascii="Helvetica" w:hAnsi="Helvetica" w:eastAsia="Helvetica" w:cs="Helvetica"/>
+                <w:i w:val="false"/>
+                <w:b w:val="false"/>
+                <w:u w:val="none"/>
+                <w:strike w:val="false"/>
+                <w:sz w:val="22"/>
+                <w:szCs w:val="22"/>
+                <w:color w:val="000000"/>
+              </w:rPr>
+            </w:pPr>
+            <w:r>
+              <w:rPr>
+                <w:rFonts w:ascii="Helvetica" w:hAnsi="Helvetica" w:eastAsia="Helvetica" w:cs="Helvetica"/>
+                <w:i w:val="false"/>
+                <w:b w:val="false"/>
+                <w:u w:val="none"/>
+                <w:strike w:val="false"/>
+                <w:sz w:val="22"/>
+                <w:szCs w:val="22"/>
+                <w:color w:val="000000"/>
+              </w:rPr>
+              <w:t xml:space="preserve">&lt;0.001</w:t>
             </w:r>
           </w:p>
         </w:tc>
@@ -9661,7 +10982,7 @@
                 <w:szCs w:val="22"/>
                 <w:color w:val="000000"/>
               </w:rPr>
-              <w:t xml:space="preserve">0.0</w:t>
+              <w:t xml:space="preserve">28</w:t>
             </w:r>
           </w:p>
         </w:tc>
@@ -9716,7 +11037,62 @@
                 <w:szCs w:val="22"/>
                 <w:color w:val="000000"/>
               </w:rPr>
-              <w:t xml:space="preserve">0.0000</w:t>
+              <w:t xml:space="preserve">0</w:t>
+            </w:r>
+          </w:p>
+        </w:tc>
+        <w:tc>
+          <w:tcPr>
+            <w:tcBorders>
+              <w:bottom w:val="none" w:sz="0" w:space="0" w:color="000000"/>
+              <w:top w:val="none" w:sz="0" w:space="0" w:color="000000"/>
+              <w:left w:val="none" w:sz="0" w:space="0" w:color="000000"/>
+              <w:right w:val="none" w:sz="0" w:space="0" w:color="000000"/>
+            </w:tcBorders>
+            <w:shd w:val="clear" w:color="auto" w:fill="FFFFFF"/>
+            <w:tcMar>
+              <w:top w:w="0" w:type="dxa"/>
+              <w:bottom w:w="0" w:type="dxa"/>
+              <w:left w:w="0" w:type="dxa"/>
+              <w:right w:w="0" w:type="dxa"/>
+            </w:tcMar>
+            <w:vAlign w:val="center"/>
+          </w:tcPr>
+          <w:p>
+            <w:pPr>
+              <w:pStyle w:val="Normal"/>
+              <w:jc w:val="left"/>
+              <w:pBdr>
+                <w:bottom w:val="none" w:sz="0" w:space="0" w:color="000000"/>
+                <w:top w:val="none" w:sz="0" w:space="0" w:color="000000"/>
+                <w:left w:val="none" w:sz="0" w:space="0" w:color="000000"/>
+                <w:right w:val="none" w:sz="0" w:space="0" w:color="000000"/>
+              </w:pBdr>
+              <w:spacing w:after="100" w:before="100" w:line="240"/>
+              <w:ind w:left="100" w:right="100" w:firstLine="0" w:firstLineChars="0"/>
+              <w:rPr>
+                <w:rFonts w:ascii="Helvetica" w:hAnsi="Helvetica" w:eastAsia="Helvetica" w:cs="Helvetica"/>
+                <w:i w:val="false"/>
+                <w:b w:val="false"/>
+                <w:u w:val="none"/>
+                <w:strike w:val="false"/>
+                <w:sz w:val="22"/>
+                <w:szCs w:val="22"/>
+                <w:color w:val="000000"/>
+              </w:rPr>
+            </w:pPr>
+            <w:r>
+              <w:rPr>
+                <w:rFonts w:ascii="Helvetica" w:hAnsi="Helvetica" w:eastAsia="Helvetica" w:cs="Helvetica"/>
+                <w:i w:val="false"/>
+                <w:b w:val="false"/>
+                <w:u w:val="none"/>
+                <w:strike w:val="false"/>
+                <w:sz w:val="22"/>
+                <w:szCs w:val="22"/>
+                <w:color w:val="000000"/>
+              </w:rPr>
+              <w:t xml:space="preserve">&lt;0.001</w:t>
             </w:r>
           </w:p>
         </w:tc>
@@ -10051,7 +11427,7 @@
                 <w:szCs w:val="22"/>
                 <w:color w:val="000000"/>
               </w:rPr>
-              <w:t xml:space="preserve">770.5</w:t>
+              <w:t xml:space="preserve">28</w:t>
             </w:r>
           </w:p>
         </w:tc>
@@ -10106,7 +11482,62 @@
                 <w:szCs w:val="22"/>
                 <w:color w:val="000000"/>
               </w:rPr>
-              <w:t xml:space="preserve">0.0000</w:t>
+              <w:t xml:space="preserve">406</w:t>
+            </w:r>
+          </w:p>
+        </w:tc>
+        <w:tc>
+          <w:tcPr>
+            <w:tcBorders>
+              <w:bottom w:val="none" w:sz="0" w:space="0" w:color="000000"/>
+              <w:top w:val="none" w:sz="0" w:space="0" w:color="000000"/>
+              <w:left w:val="none" w:sz="0" w:space="0" w:color="000000"/>
+              <w:right w:val="none" w:sz="0" w:space="0" w:color="000000"/>
+            </w:tcBorders>
+            <w:shd w:val="clear" w:color="auto" w:fill="FFFFFF"/>
+            <w:tcMar>
+              <w:top w:w="0" w:type="dxa"/>
+              <w:bottom w:w="0" w:type="dxa"/>
+              <w:left w:w="0" w:type="dxa"/>
+              <w:right w:w="0" w:type="dxa"/>
+            </w:tcMar>
+            <w:vAlign w:val="center"/>
+          </w:tcPr>
+          <w:p>
+            <w:pPr>
+              <w:pStyle w:val="Normal"/>
+              <w:jc w:val="left"/>
+              <w:pBdr>
+                <w:bottom w:val="none" w:sz="0" w:space="0" w:color="000000"/>
+                <w:top w:val="none" w:sz="0" w:space="0" w:color="000000"/>
+                <w:left w:val="none" w:sz="0" w:space="0" w:color="000000"/>
+                <w:right w:val="none" w:sz="0" w:space="0" w:color="000000"/>
+              </w:pBdr>
+              <w:spacing w:after="100" w:before="100" w:line="240"/>
+              <w:ind w:left="100" w:right="100" w:firstLine="0" w:firstLineChars="0"/>
+              <w:rPr>
+                <w:rFonts w:ascii="Helvetica" w:hAnsi="Helvetica" w:eastAsia="Helvetica" w:cs="Helvetica"/>
+                <w:i w:val="false"/>
+                <w:b w:val="false"/>
+                <w:u w:val="none"/>
+                <w:strike w:val="false"/>
+                <w:sz w:val="22"/>
+                <w:szCs w:val="22"/>
+                <w:color w:val="000000"/>
+              </w:rPr>
+            </w:pPr>
+            <w:r>
+              <w:rPr>
+                <w:rFonts w:ascii="Helvetica" w:hAnsi="Helvetica" w:eastAsia="Helvetica" w:cs="Helvetica"/>
+                <w:i w:val="false"/>
+                <w:b w:val="false"/>
+                <w:u w:val="none"/>
+                <w:strike w:val="false"/>
+                <w:sz w:val="22"/>
+                <w:szCs w:val="22"/>
+                <w:color w:val="000000"/>
+              </w:rPr>
+              <w:t xml:space="preserve">&lt;0.001</w:t>
             </w:r>
           </w:p>
         </w:tc>
@@ -10441,7 +11872,7 @@
                 <w:szCs w:val="22"/>
                 <w:color w:val="000000"/>
               </w:rPr>
-              <w:t xml:space="preserve">2.5</w:t>
+              <w:t xml:space="preserve">28</w:t>
             </w:r>
           </w:p>
         </w:tc>
@@ -10496,7 +11927,62 @@
                 <w:szCs w:val="22"/>
                 <w:color w:val="000000"/>
               </w:rPr>
-              <w:t xml:space="preserve">0.0000</w:t>
+              <w:t xml:space="preserve">0</w:t>
+            </w:r>
+          </w:p>
+        </w:tc>
+        <w:tc>
+          <w:tcPr>
+            <w:tcBorders>
+              <w:bottom w:val="none" w:sz="0" w:space="0" w:color="000000"/>
+              <w:top w:val="none" w:sz="0" w:space="0" w:color="000000"/>
+              <w:left w:val="none" w:sz="0" w:space="0" w:color="000000"/>
+              <w:right w:val="none" w:sz="0" w:space="0" w:color="000000"/>
+            </w:tcBorders>
+            <w:shd w:val="clear" w:color="auto" w:fill="FFFFFF"/>
+            <w:tcMar>
+              <w:top w:w="0" w:type="dxa"/>
+              <w:bottom w:w="0" w:type="dxa"/>
+              <w:left w:w="0" w:type="dxa"/>
+              <w:right w:w="0" w:type="dxa"/>
+            </w:tcMar>
+            <w:vAlign w:val="center"/>
+          </w:tcPr>
+          <w:p>
+            <w:pPr>
+              <w:pStyle w:val="Normal"/>
+              <w:jc w:val="left"/>
+              <w:pBdr>
+                <w:bottom w:val="none" w:sz="0" w:space="0" w:color="000000"/>
+                <w:top w:val="none" w:sz="0" w:space="0" w:color="000000"/>
+                <w:left w:val="none" w:sz="0" w:space="0" w:color="000000"/>
+                <w:right w:val="none" w:sz="0" w:space="0" w:color="000000"/>
+              </w:pBdr>
+              <w:spacing w:after="100" w:before="100" w:line="240"/>
+              <w:ind w:left="100" w:right="100" w:firstLine="0" w:firstLineChars="0"/>
+              <w:rPr>
+                <w:rFonts w:ascii="Helvetica" w:hAnsi="Helvetica" w:eastAsia="Helvetica" w:cs="Helvetica"/>
+                <w:i w:val="false"/>
+                <w:b w:val="false"/>
+                <w:u w:val="none"/>
+                <w:strike w:val="false"/>
+                <w:sz w:val="22"/>
+                <w:szCs w:val="22"/>
+                <w:color w:val="000000"/>
+              </w:rPr>
+            </w:pPr>
+            <w:r>
+              <w:rPr>
+                <w:rFonts w:ascii="Helvetica" w:hAnsi="Helvetica" w:eastAsia="Helvetica" w:cs="Helvetica"/>
+                <w:i w:val="false"/>
+                <w:b w:val="false"/>
+                <w:u w:val="none"/>
+                <w:strike w:val="false"/>
+                <w:sz w:val="22"/>
+                <w:szCs w:val="22"/>
+                <w:color w:val="000000"/>
+              </w:rPr>
+              <w:t xml:space="preserve">&lt;0.001</w:t>
             </w:r>
           </w:p>
         </w:tc>
@@ -10831,7 +12317,7 @@
                 <w:szCs w:val="22"/>
                 <w:color w:val="000000"/>
               </w:rPr>
-              <w:t xml:space="preserve">0.0</w:t>
+              <w:t xml:space="preserve">28</w:t>
             </w:r>
           </w:p>
         </w:tc>
@@ -10886,7 +12372,62 @@
                 <w:szCs w:val="22"/>
                 <w:color w:val="000000"/>
               </w:rPr>
-              <w:t xml:space="preserve">0.0000</w:t>
+              <w:t xml:space="preserve">0</w:t>
+            </w:r>
+          </w:p>
+        </w:tc>
+        <w:tc>
+          <w:tcPr>
+            <w:tcBorders>
+              <w:bottom w:val="single" w:sz="12" w:space="0" w:color="666666"/>
+              <w:top w:val="none" w:sz="0" w:space="0" w:color="000000"/>
+              <w:left w:val="none" w:sz="0" w:space="0" w:color="000000"/>
+              <w:right w:val="none" w:sz="0" w:space="0" w:color="000000"/>
+            </w:tcBorders>
+            <w:shd w:val="clear" w:color="auto" w:fill="FFFFFF"/>
+            <w:tcMar>
+              <w:top w:w="0" w:type="dxa"/>
+              <w:bottom w:w="0" w:type="dxa"/>
+              <w:left w:w="0" w:type="dxa"/>
+              <w:right w:w="0" w:type="dxa"/>
+            </w:tcMar>
+            <w:vAlign w:val="center"/>
+          </w:tcPr>
+          <w:p>
+            <w:pPr>
+              <w:pStyle w:val="Normal"/>
+              <w:jc w:val="left"/>
+              <w:pBdr>
+                <w:bottom w:val="none" w:sz="0" w:space="0" w:color="000000"/>
+                <w:top w:val="none" w:sz="0" w:space="0" w:color="000000"/>
+                <w:left w:val="none" w:sz="0" w:space="0" w:color="000000"/>
+                <w:right w:val="none" w:sz="0" w:space="0" w:color="000000"/>
+              </w:pBdr>
+              <w:spacing w:after="100" w:before="100" w:line="240"/>
+              <w:ind w:left="100" w:right="100" w:firstLine="0" w:firstLineChars="0"/>
+              <w:rPr>
+                <w:rFonts w:ascii="Helvetica" w:hAnsi="Helvetica" w:eastAsia="Helvetica" w:cs="Helvetica"/>
+                <w:i w:val="false"/>
+                <w:b w:val="false"/>
+                <w:u w:val="none"/>
+                <w:strike w:val="false"/>
+                <w:sz w:val="22"/>
+                <w:szCs w:val="22"/>
+                <w:color w:val="000000"/>
+              </w:rPr>
+            </w:pPr>
+            <w:r>
+              <w:rPr>
+                <w:rFonts w:ascii="Helvetica" w:hAnsi="Helvetica" w:eastAsia="Helvetica" w:cs="Helvetica"/>
+                <w:i w:val="false"/>
+                <w:b w:val="false"/>
+                <w:u w:val="none"/>
+                <w:strike w:val="false"/>
+                <w:sz w:val="22"/>
+                <w:szCs w:val="22"/>
+                <w:color w:val="000000"/>
+              </w:rPr>
+              <w:t xml:space="preserve">&lt;0.001</w:t>
             </w:r>
           </w:p>
         </w:tc>

</xml_diff>

<commit_message>
Updated code before submission
</commit_message>
<xml_diff>
--- a/output/Table_S3b_rarity_wilcoxon.docx
+++ b/output/Table_S3b_rarity_wilcoxon.docx
@@ -7,7 +7,7 @@
         <w:pStyle w:val="Titre1"/>
       </w:pPr>
       <w:r>
-        <w:t xml:space="preserve">Table S3b: Paired Wilcoxon signed-rank tests - rarity group comparisons</w:t>
+        <w:t xml:space="preserve">Table S3b: Wilcoxon rank-sum (Mann-Whitney) tests - rarity group comparisons</w:t>
       </w:r>
     </w:p>
     <w:tbl xmlns:a="http://schemas.openxmlformats.org/drawingml/2006/main" xmlns:pic="http://schemas.openxmlformats.org/drawingml/2006/picture">
@@ -357,7 +357,7 @@
                 <w:szCs w:val="22"/>
                 <w:color w:val="000000"/>
               </w:rPr>
-              <w:t xml:space="preserve">V_statistic</w:t>
+              <w:t xml:space="preserve">W_statistic</w:t>
             </w:r>
           </w:p>
         </w:tc>
@@ -802,7 +802,7 @@
                 <w:szCs w:val="22"/>
                 <w:color w:val="000000"/>
               </w:rPr>
-              <w:t xml:space="preserve">406</w:t>
+              <w:t xml:space="preserve">531.0</w:t>
             </w:r>
           </w:p>
         </w:tc>
@@ -857,7 +857,7 @@
                 <w:szCs w:val="22"/>
                 <w:color w:val="000000"/>
               </w:rPr>
-              <w:t xml:space="preserve">&lt;0.001</w:t>
+              <w:t xml:space="preserve">0.023</w:t>
             </w:r>
           </w:p>
         </w:tc>
@@ -912,7 +912,7 @@
                 <w:szCs w:val="22"/>
                 <w:color w:val="000000"/>
               </w:rPr>
-              <w:t xml:space="preserve">***</w:t>
+              <w:t xml:space="preserve">*</w:t>
             </w:r>
           </w:p>
         </w:tc>
@@ -1247,7 +1247,7 @@
                 <w:szCs w:val="22"/>
                 <w:color w:val="000000"/>
               </w:rPr>
-              <w:t xml:space="preserve">0</w:t>
+              <w:t xml:space="preserve">29.0</w:t>
             </w:r>
           </w:p>
         </w:tc>
@@ -1692,7 +1692,7 @@
                 <w:szCs w:val="22"/>
                 <w:color w:val="000000"/>
               </w:rPr>
-              <w:t xml:space="preserve">0</w:t>
+              <w:t xml:space="preserve">16.0</w:t>
             </w:r>
           </w:p>
         </w:tc>
@@ -2137,117 +2137,117 @@
                 <w:szCs w:val="22"/>
                 <w:color w:val="000000"/>
               </w:rPr>
-              <w:t xml:space="preserve">406</w:t>
-            </w:r>
-          </w:p>
-        </w:tc>
-        <w:tc>
-          <w:tcPr>
-            <w:tcBorders>
-              <w:bottom w:val="none" w:sz="0" w:space="0" w:color="000000"/>
-              <w:top w:val="none" w:sz="0" w:space="0" w:color="000000"/>
-              <w:left w:val="none" w:sz="0" w:space="0" w:color="000000"/>
-              <w:right w:val="none" w:sz="0" w:space="0" w:color="000000"/>
-            </w:tcBorders>
-            <w:shd w:val="clear" w:color="auto" w:fill="FFFFFF"/>
-            <w:tcMar>
-              <w:top w:w="0" w:type="dxa"/>
-              <w:bottom w:w="0" w:type="dxa"/>
-              <w:left w:w="0" w:type="dxa"/>
-              <w:right w:w="0" w:type="dxa"/>
-            </w:tcMar>
-            <w:vAlign w:val="center"/>
-          </w:tcPr>
-          <w:p>
-            <w:pPr>
-              <w:pStyle w:val="Normal"/>
-              <w:jc w:val="left"/>
-              <w:pBdr>
-                <w:bottom w:val="none" w:sz="0" w:space="0" w:color="000000"/>
-                <w:top w:val="none" w:sz="0" w:space="0" w:color="000000"/>
-                <w:left w:val="none" w:sz="0" w:space="0" w:color="000000"/>
-                <w:right w:val="none" w:sz="0" w:space="0" w:color="000000"/>
-              </w:pBdr>
-              <w:spacing w:after="100" w:before="100" w:line="240"/>
-              <w:ind w:left="100" w:right="100" w:firstLine="0" w:firstLineChars="0"/>
-              <w:rPr>
-                <w:rFonts w:ascii="Helvetica" w:hAnsi="Helvetica" w:eastAsia="Helvetica" w:cs="Helvetica"/>
-                <w:i w:val="false"/>
-                <w:b w:val="false"/>
-                <w:u w:val="none"/>
-                <w:strike w:val="false"/>
-                <w:sz w:val="22"/>
-                <w:szCs w:val="22"/>
-                <w:color w:val="000000"/>
-              </w:rPr>
-            </w:pPr>
-            <w:r>
-              <w:rPr>
-                <w:rFonts w:ascii="Helvetica" w:hAnsi="Helvetica" w:eastAsia="Helvetica" w:cs="Helvetica"/>
-                <w:i w:val="false"/>
-                <w:b w:val="false"/>
-                <w:u w:val="none"/>
-                <w:strike w:val="false"/>
-                <w:sz w:val="22"/>
-                <w:szCs w:val="22"/>
-                <w:color w:val="000000"/>
-              </w:rPr>
-              <w:t xml:space="preserve">&lt;0.001</w:t>
-            </w:r>
-          </w:p>
-        </w:tc>
-        <w:tc>
-          <w:tcPr>
-            <w:tcBorders>
-              <w:bottom w:val="none" w:sz="0" w:space="0" w:color="000000"/>
-              <w:top w:val="none" w:sz="0" w:space="0" w:color="000000"/>
-              <w:left w:val="none" w:sz="0" w:space="0" w:color="000000"/>
-              <w:right w:val="none" w:sz="0" w:space="0" w:color="000000"/>
-            </w:tcBorders>
-            <w:shd w:val="clear" w:color="auto" w:fill="FFFFFF"/>
-            <w:tcMar>
-              <w:top w:w="0" w:type="dxa"/>
-              <w:bottom w:w="0" w:type="dxa"/>
-              <w:left w:w="0" w:type="dxa"/>
-              <w:right w:w="0" w:type="dxa"/>
-            </w:tcMar>
-            <w:vAlign w:val="center"/>
-          </w:tcPr>
-          <w:p>
-            <w:pPr>
-              <w:pStyle w:val="Normal"/>
-              <w:jc w:val="left"/>
-              <w:pBdr>
-                <w:bottom w:val="none" w:sz="0" w:space="0" w:color="000000"/>
-                <w:top w:val="none" w:sz="0" w:space="0" w:color="000000"/>
-                <w:left w:val="none" w:sz="0" w:space="0" w:color="000000"/>
-                <w:right w:val="none" w:sz="0" w:space="0" w:color="000000"/>
-              </w:pBdr>
-              <w:spacing w:after="100" w:before="100" w:line="240"/>
-              <w:ind w:left="100" w:right="100" w:firstLine="0" w:firstLineChars="0"/>
-              <w:rPr>
-                <w:rFonts w:ascii="Helvetica" w:hAnsi="Helvetica" w:eastAsia="Helvetica" w:cs="Helvetica"/>
-                <w:i w:val="false"/>
-                <w:b w:val="false"/>
-                <w:u w:val="none"/>
-                <w:strike w:val="false"/>
-                <w:sz w:val="22"/>
-                <w:szCs w:val="22"/>
-                <w:color w:val="000000"/>
-              </w:rPr>
-            </w:pPr>
-            <w:r>
-              <w:rPr>
-                <w:rFonts w:ascii="Helvetica" w:hAnsi="Helvetica" w:eastAsia="Helvetica" w:cs="Helvetica"/>
-                <w:i w:val="false"/>
-                <w:b w:val="false"/>
-                <w:u w:val="none"/>
-                <w:strike w:val="false"/>
-                <w:sz w:val="22"/>
-                <w:szCs w:val="22"/>
-                <w:color w:val="000000"/>
-              </w:rPr>
-              <w:t xml:space="preserve">***</w:t>
+              <w:t xml:space="preserve">528.0</w:t>
+            </w:r>
+          </w:p>
+        </w:tc>
+        <w:tc>
+          <w:tcPr>
+            <w:tcBorders>
+              <w:bottom w:val="none" w:sz="0" w:space="0" w:color="000000"/>
+              <w:top w:val="none" w:sz="0" w:space="0" w:color="000000"/>
+              <w:left w:val="none" w:sz="0" w:space="0" w:color="000000"/>
+              <w:right w:val="none" w:sz="0" w:space="0" w:color="000000"/>
+            </w:tcBorders>
+            <w:shd w:val="clear" w:color="auto" w:fill="FFFFFF"/>
+            <w:tcMar>
+              <w:top w:w="0" w:type="dxa"/>
+              <w:bottom w:w="0" w:type="dxa"/>
+              <w:left w:w="0" w:type="dxa"/>
+              <w:right w:w="0" w:type="dxa"/>
+            </w:tcMar>
+            <w:vAlign w:val="center"/>
+          </w:tcPr>
+          <w:p>
+            <w:pPr>
+              <w:pStyle w:val="Normal"/>
+              <w:jc w:val="left"/>
+              <w:pBdr>
+                <w:bottom w:val="none" w:sz="0" w:space="0" w:color="000000"/>
+                <w:top w:val="none" w:sz="0" w:space="0" w:color="000000"/>
+                <w:left w:val="none" w:sz="0" w:space="0" w:color="000000"/>
+                <w:right w:val="none" w:sz="0" w:space="0" w:color="000000"/>
+              </w:pBdr>
+              <w:spacing w:after="100" w:before="100" w:line="240"/>
+              <w:ind w:left="100" w:right="100" w:firstLine="0" w:firstLineChars="0"/>
+              <w:rPr>
+                <w:rFonts w:ascii="Helvetica" w:hAnsi="Helvetica" w:eastAsia="Helvetica" w:cs="Helvetica"/>
+                <w:i w:val="false"/>
+                <w:b w:val="false"/>
+                <w:u w:val="none"/>
+                <w:strike w:val="false"/>
+                <w:sz w:val="22"/>
+                <w:szCs w:val="22"/>
+                <w:color w:val="000000"/>
+              </w:rPr>
+            </w:pPr>
+            <w:r>
+              <w:rPr>
+                <w:rFonts w:ascii="Helvetica" w:hAnsi="Helvetica" w:eastAsia="Helvetica" w:cs="Helvetica"/>
+                <w:i w:val="false"/>
+                <w:b w:val="false"/>
+                <w:u w:val="none"/>
+                <w:strike w:val="false"/>
+                <w:sz w:val="22"/>
+                <w:szCs w:val="22"/>
+                <w:color w:val="000000"/>
+              </w:rPr>
+              <w:t xml:space="preserve">0.026</w:t>
+            </w:r>
+          </w:p>
+        </w:tc>
+        <w:tc>
+          <w:tcPr>
+            <w:tcBorders>
+              <w:bottom w:val="none" w:sz="0" w:space="0" w:color="000000"/>
+              <w:top w:val="none" w:sz="0" w:space="0" w:color="000000"/>
+              <w:left w:val="none" w:sz="0" w:space="0" w:color="000000"/>
+              <w:right w:val="none" w:sz="0" w:space="0" w:color="000000"/>
+            </w:tcBorders>
+            <w:shd w:val="clear" w:color="auto" w:fill="FFFFFF"/>
+            <w:tcMar>
+              <w:top w:w="0" w:type="dxa"/>
+              <w:bottom w:w="0" w:type="dxa"/>
+              <w:left w:w="0" w:type="dxa"/>
+              <w:right w:w="0" w:type="dxa"/>
+            </w:tcMar>
+            <w:vAlign w:val="center"/>
+          </w:tcPr>
+          <w:p>
+            <w:pPr>
+              <w:pStyle w:val="Normal"/>
+              <w:jc w:val="left"/>
+              <w:pBdr>
+                <w:bottom w:val="none" w:sz="0" w:space="0" w:color="000000"/>
+                <w:top w:val="none" w:sz="0" w:space="0" w:color="000000"/>
+                <w:left w:val="none" w:sz="0" w:space="0" w:color="000000"/>
+                <w:right w:val="none" w:sz="0" w:space="0" w:color="000000"/>
+              </w:pBdr>
+              <w:spacing w:after="100" w:before="100" w:line="240"/>
+              <w:ind w:left="100" w:right="100" w:firstLine="0" w:firstLineChars="0"/>
+              <w:rPr>
+                <w:rFonts w:ascii="Helvetica" w:hAnsi="Helvetica" w:eastAsia="Helvetica" w:cs="Helvetica"/>
+                <w:i w:val="false"/>
+                <w:b w:val="false"/>
+                <w:u w:val="none"/>
+                <w:strike w:val="false"/>
+                <w:sz w:val="22"/>
+                <w:szCs w:val="22"/>
+                <w:color w:val="000000"/>
+              </w:rPr>
+            </w:pPr>
+            <w:r>
+              <w:rPr>
+                <w:rFonts w:ascii="Helvetica" w:hAnsi="Helvetica" w:eastAsia="Helvetica" w:cs="Helvetica"/>
+                <w:i w:val="false"/>
+                <w:b w:val="false"/>
+                <w:u w:val="none"/>
+                <w:strike w:val="false"/>
+                <w:sz w:val="22"/>
+                <w:szCs w:val="22"/>
+                <w:color w:val="000000"/>
+              </w:rPr>
+              <w:t xml:space="preserve">*</w:t>
             </w:r>
           </w:p>
         </w:tc>
@@ -2582,7 +2582,7 @@
                 <w:szCs w:val="22"/>
                 <w:color w:val="000000"/>
               </w:rPr>
-              <w:t xml:space="preserve">0</w:t>
+              <w:t xml:space="preserve">25.0</w:t>
             </w:r>
           </w:p>
         </w:tc>
@@ -3027,7 +3027,7 @@
                 <w:szCs w:val="22"/>
                 <w:color w:val="000000"/>
               </w:rPr>
-              <w:t xml:space="preserve">0</w:t>
+              <w:t xml:space="preserve">14.0</w:t>
             </w:r>
           </w:p>
         </w:tc>
@@ -3472,117 +3472,117 @@
                 <w:szCs w:val="22"/>
                 <w:color w:val="000000"/>
               </w:rPr>
-              <w:t xml:space="preserve">404</w:t>
-            </w:r>
-          </w:p>
-        </w:tc>
-        <w:tc>
-          <w:tcPr>
-            <w:tcBorders>
-              <w:bottom w:val="none" w:sz="0" w:space="0" w:color="000000"/>
-              <w:top w:val="none" w:sz="0" w:space="0" w:color="000000"/>
-              <w:left w:val="none" w:sz="0" w:space="0" w:color="000000"/>
-              <w:right w:val="none" w:sz="0" w:space="0" w:color="000000"/>
-            </w:tcBorders>
-            <w:shd w:val="clear" w:color="auto" w:fill="FFFFFF"/>
-            <w:tcMar>
-              <w:top w:w="0" w:type="dxa"/>
-              <w:bottom w:w="0" w:type="dxa"/>
-              <w:left w:w="0" w:type="dxa"/>
-              <w:right w:w="0" w:type="dxa"/>
-            </w:tcMar>
-            <w:vAlign w:val="center"/>
-          </w:tcPr>
-          <w:p>
-            <w:pPr>
-              <w:pStyle w:val="Normal"/>
-              <w:jc w:val="left"/>
-              <w:pBdr>
-                <w:bottom w:val="none" w:sz="0" w:space="0" w:color="000000"/>
-                <w:top w:val="none" w:sz="0" w:space="0" w:color="000000"/>
-                <w:left w:val="none" w:sz="0" w:space="0" w:color="000000"/>
-                <w:right w:val="none" w:sz="0" w:space="0" w:color="000000"/>
-              </w:pBdr>
-              <w:spacing w:after="100" w:before="100" w:line="240"/>
-              <w:ind w:left="100" w:right="100" w:firstLine="0" w:firstLineChars="0"/>
-              <w:rPr>
-                <w:rFonts w:ascii="Helvetica" w:hAnsi="Helvetica" w:eastAsia="Helvetica" w:cs="Helvetica"/>
-                <w:i w:val="false"/>
-                <w:b w:val="false"/>
-                <w:u w:val="none"/>
-                <w:strike w:val="false"/>
-                <w:sz w:val="22"/>
-                <w:szCs w:val="22"/>
-                <w:color w:val="000000"/>
-              </w:rPr>
-            </w:pPr>
-            <w:r>
-              <w:rPr>
-                <w:rFonts w:ascii="Helvetica" w:hAnsi="Helvetica" w:eastAsia="Helvetica" w:cs="Helvetica"/>
-                <w:i w:val="false"/>
-                <w:b w:val="false"/>
-                <w:u w:val="none"/>
-                <w:strike w:val="false"/>
-                <w:sz w:val="22"/>
-                <w:szCs w:val="22"/>
-                <w:color w:val="000000"/>
-              </w:rPr>
-              <w:t xml:space="preserve">&lt;0.001</w:t>
-            </w:r>
-          </w:p>
-        </w:tc>
-        <w:tc>
-          <w:tcPr>
-            <w:tcBorders>
-              <w:bottom w:val="none" w:sz="0" w:space="0" w:color="000000"/>
-              <w:top w:val="none" w:sz="0" w:space="0" w:color="000000"/>
-              <w:left w:val="none" w:sz="0" w:space="0" w:color="000000"/>
-              <w:right w:val="none" w:sz="0" w:space="0" w:color="000000"/>
-            </w:tcBorders>
-            <w:shd w:val="clear" w:color="auto" w:fill="FFFFFF"/>
-            <w:tcMar>
-              <w:top w:w="0" w:type="dxa"/>
-              <w:bottom w:w="0" w:type="dxa"/>
-              <w:left w:w="0" w:type="dxa"/>
-              <w:right w:w="0" w:type="dxa"/>
-            </w:tcMar>
-            <w:vAlign w:val="center"/>
-          </w:tcPr>
-          <w:p>
-            <w:pPr>
-              <w:pStyle w:val="Normal"/>
-              <w:jc w:val="left"/>
-              <w:pBdr>
-                <w:bottom w:val="none" w:sz="0" w:space="0" w:color="000000"/>
-                <w:top w:val="none" w:sz="0" w:space="0" w:color="000000"/>
-                <w:left w:val="none" w:sz="0" w:space="0" w:color="000000"/>
-                <w:right w:val="none" w:sz="0" w:space="0" w:color="000000"/>
-              </w:pBdr>
-              <w:spacing w:after="100" w:before="100" w:line="240"/>
-              <w:ind w:left="100" w:right="100" w:firstLine="0" w:firstLineChars="0"/>
-              <w:rPr>
-                <w:rFonts w:ascii="Helvetica" w:hAnsi="Helvetica" w:eastAsia="Helvetica" w:cs="Helvetica"/>
-                <w:i w:val="false"/>
-                <w:b w:val="false"/>
-                <w:u w:val="none"/>
-                <w:strike w:val="false"/>
-                <w:sz w:val="22"/>
-                <w:szCs w:val="22"/>
-                <w:color w:val="000000"/>
-              </w:rPr>
-            </w:pPr>
-            <w:r>
-              <w:rPr>
-                <w:rFonts w:ascii="Helvetica" w:hAnsi="Helvetica" w:eastAsia="Helvetica" w:cs="Helvetica"/>
-                <w:i w:val="false"/>
-                <w:b w:val="false"/>
-                <w:u w:val="none"/>
-                <w:strike w:val="false"/>
-                <w:sz w:val="22"/>
-                <w:szCs w:val="22"/>
-                <w:color w:val="000000"/>
-              </w:rPr>
-              <w:t xml:space="preserve">***</w:t>
+              <w:t xml:space="preserve">503.0</w:t>
+            </w:r>
+          </w:p>
+        </w:tc>
+        <w:tc>
+          <w:tcPr>
+            <w:tcBorders>
+              <w:bottom w:val="none" w:sz="0" w:space="0" w:color="000000"/>
+              <w:top w:val="none" w:sz="0" w:space="0" w:color="000000"/>
+              <w:left w:val="none" w:sz="0" w:space="0" w:color="000000"/>
+              <w:right w:val="none" w:sz="0" w:space="0" w:color="000000"/>
+            </w:tcBorders>
+            <w:shd w:val="clear" w:color="auto" w:fill="FFFFFF"/>
+            <w:tcMar>
+              <w:top w:w="0" w:type="dxa"/>
+              <w:bottom w:w="0" w:type="dxa"/>
+              <w:left w:w="0" w:type="dxa"/>
+              <w:right w:w="0" w:type="dxa"/>
+            </w:tcMar>
+            <w:vAlign w:val="center"/>
+          </w:tcPr>
+          <w:p>
+            <w:pPr>
+              <w:pStyle w:val="Normal"/>
+              <w:jc w:val="left"/>
+              <w:pBdr>
+                <w:bottom w:val="none" w:sz="0" w:space="0" w:color="000000"/>
+                <w:top w:val="none" w:sz="0" w:space="0" w:color="000000"/>
+                <w:left w:val="none" w:sz="0" w:space="0" w:color="000000"/>
+                <w:right w:val="none" w:sz="0" w:space="0" w:color="000000"/>
+              </w:pBdr>
+              <w:spacing w:after="100" w:before="100" w:line="240"/>
+              <w:ind w:left="100" w:right="100" w:firstLine="0" w:firstLineChars="0"/>
+              <w:rPr>
+                <w:rFonts w:ascii="Helvetica" w:hAnsi="Helvetica" w:eastAsia="Helvetica" w:cs="Helvetica"/>
+                <w:i w:val="false"/>
+                <w:b w:val="false"/>
+                <w:u w:val="none"/>
+                <w:strike w:val="false"/>
+                <w:sz w:val="22"/>
+                <w:szCs w:val="22"/>
+                <w:color w:val="000000"/>
+              </w:rPr>
+            </w:pPr>
+            <w:r>
+              <w:rPr>
+                <w:rFonts w:ascii="Helvetica" w:hAnsi="Helvetica" w:eastAsia="Helvetica" w:cs="Helvetica"/>
+                <w:i w:val="false"/>
+                <w:b w:val="false"/>
+                <w:u w:val="none"/>
+                <w:strike w:val="false"/>
+                <w:sz w:val="22"/>
+                <w:szCs w:val="22"/>
+                <w:color w:val="000000"/>
+              </w:rPr>
+              <w:t xml:space="preserve">0.070</w:t>
+            </w:r>
+          </w:p>
+        </w:tc>
+        <w:tc>
+          <w:tcPr>
+            <w:tcBorders>
+              <w:bottom w:val="none" w:sz="0" w:space="0" w:color="000000"/>
+              <w:top w:val="none" w:sz="0" w:space="0" w:color="000000"/>
+              <w:left w:val="none" w:sz="0" w:space="0" w:color="000000"/>
+              <w:right w:val="none" w:sz="0" w:space="0" w:color="000000"/>
+            </w:tcBorders>
+            <w:shd w:val="clear" w:color="auto" w:fill="FFFFFF"/>
+            <w:tcMar>
+              <w:top w:w="0" w:type="dxa"/>
+              <w:bottom w:w="0" w:type="dxa"/>
+              <w:left w:w="0" w:type="dxa"/>
+              <w:right w:w="0" w:type="dxa"/>
+            </w:tcMar>
+            <w:vAlign w:val="center"/>
+          </w:tcPr>
+          <w:p>
+            <w:pPr>
+              <w:pStyle w:val="Normal"/>
+              <w:jc w:val="left"/>
+              <w:pBdr>
+                <w:bottom w:val="none" w:sz="0" w:space="0" w:color="000000"/>
+                <w:top w:val="none" w:sz="0" w:space="0" w:color="000000"/>
+                <w:left w:val="none" w:sz="0" w:space="0" w:color="000000"/>
+                <w:right w:val="none" w:sz="0" w:space="0" w:color="000000"/>
+              </w:pBdr>
+              <w:spacing w:after="100" w:before="100" w:line="240"/>
+              <w:ind w:left="100" w:right="100" w:firstLine="0" w:firstLineChars="0"/>
+              <w:rPr>
+                <w:rFonts w:ascii="Helvetica" w:hAnsi="Helvetica" w:eastAsia="Helvetica" w:cs="Helvetica"/>
+                <w:i w:val="false"/>
+                <w:b w:val="false"/>
+                <w:u w:val="none"/>
+                <w:strike w:val="false"/>
+                <w:sz w:val="22"/>
+                <w:szCs w:val="22"/>
+                <w:color w:val="000000"/>
+              </w:rPr>
+            </w:pPr>
+            <w:r>
+              <w:rPr>
+                <w:rFonts w:ascii="Helvetica" w:hAnsi="Helvetica" w:eastAsia="Helvetica" w:cs="Helvetica"/>
+                <w:i w:val="false"/>
+                <w:b w:val="false"/>
+                <w:u w:val="none"/>
+                <w:strike w:val="false"/>
+                <w:sz w:val="22"/>
+                <w:szCs w:val="22"/>
+                <w:color w:val="000000"/>
+              </w:rPr>
+              <w:t xml:space="preserve">ns</w:t>
             </w:r>
           </w:p>
         </w:tc>
@@ -3917,7 +3917,7 @@
                 <w:szCs w:val="22"/>
                 <w:color w:val="000000"/>
               </w:rPr>
-              <w:t xml:space="preserve">3</w:t>
+              <w:t xml:space="preserve">34.0</w:t>
             </w:r>
           </w:p>
         </w:tc>
@@ -4362,7 +4362,7 @@
                 <w:szCs w:val="22"/>
                 <w:color w:val="000000"/>
               </w:rPr>
-              <w:t xml:space="preserve">3</w:t>
+              <w:t xml:space="preserve">19.0</w:t>
             </w:r>
           </w:p>
         </w:tc>
@@ -4807,117 +4807,117 @@
                 <w:szCs w:val="22"/>
                 <w:color w:val="000000"/>
               </w:rPr>
-              <w:t xml:space="preserve">398</w:t>
-            </w:r>
-          </w:p>
-        </w:tc>
-        <w:tc>
-          <w:tcPr>
-            <w:tcBorders>
-              <w:bottom w:val="none" w:sz="0" w:space="0" w:color="000000"/>
-              <w:top w:val="none" w:sz="0" w:space="0" w:color="000000"/>
-              <w:left w:val="none" w:sz="0" w:space="0" w:color="000000"/>
-              <w:right w:val="none" w:sz="0" w:space="0" w:color="000000"/>
-            </w:tcBorders>
-            <w:shd w:val="clear" w:color="auto" w:fill="FFFFFF"/>
-            <w:tcMar>
-              <w:top w:w="0" w:type="dxa"/>
-              <w:bottom w:w="0" w:type="dxa"/>
-              <w:left w:w="0" w:type="dxa"/>
-              <w:right w:w="0" w:type="dxa"/>
-            </w:tcMar>
-            <w:vAlign w:val="center"/>
-          </w:tcPr>
-          <w:p>
-            <w:pPr>
-              <w:pStyle w:val="Normal"/>
-              <w:jc w:val="left"/>
-              <w:pBdr>
-                <w:bottom w:val="none" w:sz="0" w:space="0" w:color="000000"/>
-                <w:top w:val="none" w:sz="0" w:space="0" w:color="000000"/>
-                <w:left w:val="none" w:sz="0" w:space="0" w:color="000000"/>
-                <w:right w:val="none" w:sz="0" w:space="0" w:color="000000"/>
-              </w:pBdr>
-              <w:spacing w:after="100" w:before="100" w:line="240"/>
-              <w:ind w:left="100" w:right="100" w:firstLine="0" w:firstLineChars="0"/>
-              <w:rPr>
-                <w:rFonts w:ascii="Helvetica" w:hAnsi="Helvetica" w:eastAsia="Helvetica" w:cs="Helvetica"/>
-                <w:i w:val="false"/>
-                <w:b w:val="false"/>
-                <w:u w:val="none"/>
-                <w:strike w:val="false"/>
-                <w:sz w:val="22"/>
-                <w:szCs w:val="22"/>
-                <w:color w:val="000000"/>
-              </w:rPr>
-            </w:pPr>
-            <w:r>
-              <w:rPr>
-                <w:rFonts w:ascii="Helvetica" w:hAnsi="Helvetica" w:eastAsia="Helvetica" w:cs="Helvetica"/>
-                <w:i w:val="false"/>
-                <w:b w:val="false"/>
-                <w:u w:val="none"/>
-                <w:strike w:val="false"/>
-                <w:sz w:val="22"/>
-                <w:szCs w:val="22"/>
-                <w:color w:val="000000"/>
-              </w:rPr>
-              <w:t xml:space="preserve">&lt;0.001</w:t>
-            </w:r>
-          </w:p>
-        </w:tc>
-        <w:tc>
-          <w:tcPr>
-            <w:tcBorders>
-              <w:bottom w:val="none" w:sz="0" w:space="0" w:color="000000"/>
-              <w:top w:val="none" w:sz="0" w:space="0" w:color="000000"/>
-              <w:left w:val="none" w:sz="0" w:space="0" w:color="000000"/>
-              <w:right w:val="none" w:sz="0" w:space="0" w:color="000000"/>
-            </w:tcBorders>
-            <w:shd w:val="clear" w:color="auto" w:fill="FFFFFF"/>
-            <w:tcMar>
-              <w:top w:w="0" w:type="dxa"/>
-              <w:bottom w:w="0" w:type="dxa"/>
-              <w:left w:w="0" w:type="dxa"/>
-              <w:right w:w="0" w:type="dxa"/>
-            </w:tcMar>
-            <w:vAlign w:val="center"/>
-          </w:tcPr>
-          <w:p>
-            <w:pPr>
-              <w:pStyle w:val="Normal"/>
-              <w:jc w:val="left"/>
-              <w:pBdr>
-                <w:bottom w:val="none" w:sz="0" w:space="0" w:color="000000"/>
-                <w:top w:val="none" w:sz="0" w:space="0" w:color="000000"/>
-                <w:left w:val="none" w:sz="0" w:space="0" w:color="000000"/>
-                <w:right w:val="none" w:sz="0" w:space="0" w:color="000000"/>
-              </w:pBdr>
-              <w:spacing w:after="100" w:before="100" w:line="240"/>
-              <w:ind w:left="100" w:right="100" w:firstLine="0" w:firstLineChars="0"/>
-              <w:rPr>
-                <w:rFonts w:ascii="Helvetica" w:hAnsi="Helvetica" w:eastAsia="Helvetica" w:cs="Helvetica"/>
-                <w:i w:val="false"/>
-                <w:b w:val="false"/>
-                <w:u w:val="none"/>
-                <w:strike w:val="false"/>
-                <w:sz w:val="22"/>
-                <w:szCs w:val="22"/>
-                <w:color w:val="000000"/>
-              </w:rPr>
-            </w:pPr>
-            <w:r>
-              <w:rPr>
-                <w:rFonts w:ascii="Helvetica" w:hAnsi="Helvetica" w:eastAsia="Helvetica" w:cs="Helvetica"/>
-                <w:i w:val="false"/>
-                <w:b w:val="false"/>
-                <w:u w:val="none"/>
-                <w:strike w:val="false"/>
-                <w:sz w:val="22"/>
-                <w:szCs w:val="22"/>
-                <w:color w:val="000000"/>
-              </w:rPr>
-              <w:t xml:space="preserve">***</w:t>
+              <w:t xml:space="preserve">497.0</w:t>
+            </w:r>
+          </w:p>
+        </w:tc>
+        <w:tc>
+          <w:tcPr>
+            <w:tcBorders>
+              <w:bottom w:val="none" w:sz="0" w:space="0" w:color="000000"/>
+              <w:top w:val="none" w:sz="0" w:space="0" w:color="000000"/>
+              <w:left w:val="none" w:sz="0" w:space="0" w:color="000000"/>
+              <w:right w:val="none" w:sz="0" w:space="0" w:color="000000"/>
+            </w:tcBorders>
+            <w:shd w:val="clear" w:color="auto" w:fill="FFFFFF"/>
+            <w:tcMar>
+              <w:top w:w="0" w:type="dxa"/>
+              <w:bottom w:w="0" w:type="dxa"/>
+              <w:left w:w="0" w:type="dxa"/>
+              <w:right w:w="0" w:type="dxa"/>
+            </w:tcMar>
+            <w:vAlign w:val="center"/>
+          </w:tcPr>
+          <w:p>
+            <w:pPr>
+              <w:pStyle w:val="Normal"/>
+              <w:jc w:val="left"/>
+              <w:pBdr>
+                <w:bottom w:val="none" w:sz="0" w:space="0" w:color="000000"/>
+                <w:top w:val="none" w:sz="0" w:space="0" w:color="000000"/>
+                <w:left w:val="none" w:sz="0" w:space="0" w:color="000000"/>
+                <w:right w:val="none" w:sz="0" w:space="0" w:color="000000"/>
+              </w:pBdr>
+              <w:spacing w:after="100" w:before="100" w:line="240"/>
+              <w:ind w:left="100" w:right="100" w:firstLine="0" w:firstLineChars="0"/>
+              <w:rPr>
+                <w:rFonts w:ascii="Helvetica" w:hAnsi="Helvetica" w:eastAsia="Helvetica" w:cs="Helvetica"/>
+                <w:i w:val="false"/>
+                <w:b w:val="false"/>
+                <w:u w:val="none"/>
+                <w:strike w:val="false"/>
+                <w:sz w:val="22"/>
+                <w:szCs w:val="22"/>
+                <w:color w:val="000000"/>
+              </w:rPr>
+            </w:pPr>
+            <w:r>
+              <w:rPr>
+                <w:rFonts w:ascii="Helvetica" w:hAnsi="Helvetica" w:eastAsia="Helvetica" w:cs="Helvetica"/>
+                <w:i w:val="false"/>
+                <w:b w:val="false"/>
+                <w:u w:val="none"/>
+                <w:strike w:val="false"/>
+                <w:sz w:val="22"/>
+                <w:szCs w:val="22"/>
+                <w:color w:val="000000"/>
+              </w:rPr>
+              <w:t xml:space="preserve">0.087</w:t>
+            </w:r>
+          </w:p>
+        </w:tc>
+        <w:tc>
+          <w:tcPr>
+            <w:tcBorders>
+              <w:bottom w:val="none" w:sz="0" w:space="0" w:color="000000"/>
+              <w:top w:val="none" w:sz="0" w:space="0" w:color="000000"/>
+              <w:left w:val="none" w:sz="0" w:space="0" w:color="000000"/>
+              <w:right w:val="none" w:sz="0" w:space="0" w:color="000000"/>
+            </w:tcBorders>
+            <w:shd w:val="clear" w:color="auto" w:fill="FFFFFF"/>
+            <w:tcMar>
+              <w:top w:w="0" w:type="dxa"/>
+              <w:bottom w:w="0" w:type="dxa"/>
+              <w:left w:w="0" w:type="dxa"/>
+              <w:right w:w="0" w:type="dxa"/>
+            </w:tcMar>
+            <w:vAlign w:val="center"/>
+          </w:tcPr>
+          <w:p>
+            <w:pPr>
+              <w:pStyle w:val="Normal"/>
+              <w:jc w:val="left"/>
+              <w:pBdr>
+                <w:bottom w:val="none" w:sz="0" w:space="0" w:color="000000"/>
+                <w:top w:val="none" w:sz="0" w:space="0" w:color="000000"/>
+                <w:left w:val="none" w:sz="0" w:space="0" w:color="000000"/>
+                <w:right w:val="none" w:sz="0" w:space="0" w:color="000000"/>
+              </w:pBdr>
+              <w:spacing w:after="100" w:before="100" w:line="240"/>
+              <w:ind w:left="100" w:right="100" w:firstLine="0" w:firstLineChars="0"/>
+              <w:rPr>
+                <w:rFonts w:ascii="Helvetica" w:hAnsi="Helvetica" w:eastAsia="Helvetica" w:cs="Helvetica"/>
+                <w:i w:val="false"/>
+                <w:b w:val="false"/>
+                <w:u w:val="none"/>
+                <w:strike w:val="false"/>
+                <w:sz w:val="22"/>
+                <w:szCs w:val="22"/>
+                <w:color w:val="000000"/>
+              </w:rPr>
+            </w:pPr>
+            <w:r>
+              <w:rPr>
+                <w:rFonts w:ascii="Helvetica" w:hAnsi="Helvetica" w:eastAsia="Helvetica" w:cs="Helvetica"/>
+                <w:i w:val="false"/>
+                <w:b w:val="false"/>
+                <w:u w:val="none"/>
+                <w:strike w:val="false"/>
+                <w:sz w:val="22"/>
+                <w:szCs w:val="22"/>
+                <w:color w:val="000000"/>
+              </w:rPr>
+              <w:t xml:space="preserve">ns</w:t>
             </w:r>
           </w:p>
         </w:tc>
@@ -5252,7 +5252,7 @@
                 <w:szCs w:val="22"/>
                 <w:color w:val="000000"/>
               </w:rPr>
-              <w:t xml:space="preserve">0</w:t>
+              <w:t xml:space="preserve">26.0</w:t>
             </w:r>
           </w:p>
         </w:tc>
@@ -5697,7 +5697,7 @@
                 <w:szCs w:val="22"/>
                 <w:color w:val="000000"/>
               </w:rPr>
-              <w:t xml:space="preserve">0</w:t>
+              <w:t xml:space="preserve">16.0</w:t>
             </w:r>
           </w:p>
         </w:tc>
@@ -6142,117 +6142,117 @@
                 <w:szCs w:val="22"/>
                 <w:color w:val="000000"/>
               </w:rPr>
-              <w:t xml:space="preserve">386</w:t>
-            </w:r>
-          </w:p>
-        </w:tc>
-        <w:tc>
-          <w:tcPr>
-            <w:tcBorders>
-              <w:bottom w:val="none" w:sz="0" w:space="0" w:color="000000"/>
-              <w:top w:val="none" w:sz="0" w:space="0" w:color="000000"/>
-              <w:left w:val="none" w:sz="0" w:space="0" w:color="000000"/>
-              <w:right w:val="none" w:sz="0" w:space="0" w:color="000000"/>
-            </w:tcBorders>
-            <w:shd w:val="clear" w:color="auto" w:fill="FFFFFF"/>
-            <w:tcMar>
-              <w:top w:w="0" w:type="dxa"/>
-              <w:bottom w:w="0" w:type="dxa"/>
-              <w:left w:w="0" w:type="dxa"/>
-              <w:right w:w="0" w:type="dxa"/>
-            </w:tcMar>
-            <w:vAlign w:val="center"/>
-          </w:tcPr>
-          <w:p>
-            <w:pPr>
-              <w:pStyle w:val="Normal"/>
-              <w:jc w:val="left"/>
-              <w:pBdr>
-                <w:bottom w:val="none" w:sz="0" w:space="0" w:color="000000"/>
-                <w:top w:val="none" w:sz="0" w:space="0" w:color="000000"/>
-                <w:left w:val="none" w:sz="0" w:space="0" w:color="000000"/>
-                <w:right w:val="none" w:sz="0" w:space="0" w:color="000000"/>
-              </w:pBdr>
-              <w:spacing w:after="100" w:before="100" w:line="240"/>
-              <w:ind w:left="100" w:right="100" w:firstLine="0" w:firstLineChars="0"/>
-              <w:rPr>
-                <w:rFonts w:ascii="Helvetica" w:hAnsi="Helvetica" w:eastAsia="Helvetica" w:cs="Helvetica"/>
-                <w:i w:val="false"/>
-                <w:b w:val="false"/>
-                <w:u w:val="none"/>
-                <w:strike w:val="false"/>
-                <w:sz w:val="22"/>
-                <w:szCs w:val="22"/>
-                <w:color w:val="000000"/>
-              </w:rPr>
-            </w:pPr>
-            <w:r>
-              <w:rPr>
-                <w:rFonts w:ascii="Helvetica" w:hAnsi="Helvetica" w:eastAsia="Helvetica" w:cs="Helvetica"/>
-                <w:i w:val="false"/>
-                <w:b w:val="false"/>
-                <w:u w:val="none"/>
-                <w:strike w:val="false"/>
-                <w:sz w:val="22"/>
-                <w:szCs w:val="22"/>
-                <w:color w:val="000000"/>
-              </w:rPr>
-              <w:t xml:space="preserve">&lt;0.001</w:t>
-            </w:r>
-          </w:p>
-        </w:tc>
-        <w:tc>
-          <w:tcPr>
-            <w:tcBorders>
-              <w:bottom w:val="none" w:sz="0" w:space="0" w:color="000000"/>
-              <w:top w:val="none" w:sz="0" w:space="0" w:color="000000"/>
-              <w:left w:val="none" w:sz="0" w:space="0" w:color="000000"/>
-              <w:right w:val="none" w:sz="0" w:space="0" w:color="000000"/>
-            </w:tcBorders>
-            <w:shd w:val="clear" w:color="auto" w:fill="FFFFFF"/>
-            <w:tcMar>
-              <w:top w:w="0" w:type="dxa"/>
-              <w:bottom w:w="0" w:type="dxa"/>
-              <w:left w:w="0" w:type="dxa"/>
-              <w:right w:w="0" w:type="dxa"/>
-            </w:tcMar>
-            <w:vAlign w:val="center"/>
-          </w:tcPr>
-          <w:p>
-            <w:pPr>
-              <w:pStyle w:val="Normal"/>
-              <w:jc w:val="left"/>
-              <w:pBdr>
-                <w:bottom w:val="none" w:sz="0" w:space="0" w:color="000000"/>
-                <w:top w:val="none" w:sz="0" w:space="0" w:color="000000"/>
-                <w:left w:val="none" w:sz="0" w:space="0" w:color="000000"/>
-                <w:right w:val="none" w:sz="0" w:space="0" w:color="000000"/>
-              </w:pBdr>
-              <w:spacing w:after="100" w:before="100" w:line="240"/>
-              <w:ind w:left="100" w:right="100" w:firstLine="0" w:firstLineChars="0"/>
-              <w:rPr>
-                <w:rFonts w:ascii="Helvetica" w:hAnsi="Helvetica" w:eastAsia="Helvetica" w:cs="Helvetica"/>
-                <w:i w:val="false"/>
-                <w:b w:val="false"/>
-                <w:u w:val="none"/>
-                <w:strike w:val="false"/>
-                <w:sz w:val="22"/>
-                <w:szCs w:val="22"/>
-                <w:color w:val="000000"/>
-              </w:rPr>
-            </w:pPr>
-            <w:r>
-              <w:rPr>
-                <w:rFonts w:ascii="Helvetica" w:hAnsi="Helvetica" w:eastAsia="Helvetica" w:cs="Helvetica"/>
-                <w:i w:val="false"/>
-                <w:b w:val="false"/>
-                <w:u w:val="none"/>
-                <w:strike w:val="false"/>
-                <w:sz w:val="22"/>
-                <w:szCs w:val="22"/>
-                <w:color w:val="000000"/>
-              </w:rPr>
-              <w:t xml:space="preserve">***</w:t>
+              <w:t xml:space="preserve">498.0</w:t>
+            </w:r>
+          </w:p>
+        </w:tc>
+        <w:tc>
+          <w:tcPr>
+            <w:tcBorders>
+              <w:bottom w:val="none" w:sz="0" w:space="0" w:color="000000"/>
+              <w:top w:val="none" w:sz="0" w:space="0" w:color="000000"/>
+              <w:left w:val="none" w:sz="0" w:space="0" w:color="000000"/>
+              <w:right w:val="none" w:sz="0" w:space="0" w:color="000000"/>
+            </w:tcBorders>
+            <w:shd w:val="clear" w:color="auto" w:fill="FFFFFF"/>
+            <w:tcMar>
+              <w:top w:w="0" w:type="dxa"/>
+              <w:bottom w:w="0" w:type="dxa"/>
+              <w:left w:w="0" w:type="dxa"/>
+              <w:right w:w="0" w:type="dxa"/>
+            </w:tcMar>
+            <w:vAlign w:val="center"/>
+          </w:tcPr>
+          <w:p>
+            <w:pPr>
+              <w:pStyle w:val="Normal"/>
+              <w:jc w:val="left"/>
+              <w:pBdr>
+                <w:bottom w:val="none" w:sz="0" w:space="0" w:color="000000"/>
+                <w:top w:val="none" w:sz="0" w:space="0" w:color="000000"/>
+                <w:left w:val="none" w:sz="0" w:space="0" w:color="000000"/>
+                <w:right w:val="none" w:sz="0" w:space="0" w:color="000000"/>
+              </w:pBdr>
+              <w:spacing w:after="100" w:before="100" w:line="240"/>
+              <w:ind w:left="100" w:right="100" w:firstLine="0" w:firstLineChars="0"/>
+              <w:rPr>
+                <w:rFonts w:ascii="Helvetica" w:hAnsi="Helvetica" w:eastAsia="Helvetica" w:cs="Helvetica"/>
+                <w:i w:val="false"/>
+                <w:b w:val="false"/>
+                <w:u w:val="none"/>
+                <w:strike w:val="false"/>
+                <w:sz w:val="22"/>
+                <w:szCs w:val="22"/>
+                <w:color w:val="000000"/>
+              </w:rPr>
+            </w:pPr>
+            <w:r>
+              <w:rPr>
+                <w:rFonts w:ascii="Helvetica" w:hAnsi="Helvetica" w:eastAsia="Helvetica" w:cs="Helvetica"/>
+                <w:i w:val="false"/>
+                <w:b w:val="false"/>
+                <w:u w:val="none"/>
+                <w:strike w:val="false"/>
+                <w:sz w:val="22"/>
+                <w:szCs w:val="22"/>
+                <w:color w:val="000000"/>
+              </w:rPr>
+              <w:t xml:space="preserve">0.084</w:t>
+            </w:r>
+          </w:p>
+        </w:tc>
+        <w:tc>
+          <w:tcPr>
+            <w:tcBorders>
+              <w:bottom w:val="none" w:sz="0" w:space="0" w:color="000000"/>
+              <w:top w:val="none" w:sz="0" w:space="0" w:color="000000"/>
+              <w:left w:val="none" w:sz="0" w:space="0" w:color="000000"/>
+              <w:right w:val="none" w:sz="0" w:space="0" w:color="000000"/>
+            </w:tcBorders>
+            <w:shd w:val="clear" w:color="auto" w:fill="FFFFFF"/>
+            <w:tcMar>
+              <w:top w:w="0" w:type="dxa"/>
+              <w:bottom w:w="0" w:type="dxa"/>
+              <w:left w:w="0" w:type="dxa"/>
+              <w:right w:w="0" w:type="dxa"/>
+            </w:tcMar>
+            <w:vAlign w:val="center"/>
+          </w:tcPr>
+          <w:p>
+            <w:pPr>
+              <w:pStyle w:val="Normal"/>
+              <w:jc w:val="left"/>
+              <w:pBdr>
+                <w:bottom w:val="none" w:sz="0" w:space="0" w:color="000000"/>
+                <w:top w:val="none" w:sz="0" w:space="0" w:color="000000"/>
+                <w:left w:val="none" w:sz="0" w:space="0" w:color="000000"/>
+                <w:right w:val="none" w:sz="0" w:space="0" w:color="000000"/>
+              </w:pBdr>
+              <w:spacing w:after="100" w:before="100" w:line="240"/>
+              <w:ind w:left="100" w:right="100" w:firstLine="0" w:firstLineChars="0"/>
+              <w:rPr>
+                <w:rFonts w:ascii="Helvetica" w:hAnsi="Helvetica" w:eastAsia="Helvetica" w:cs="Helvetica"/>
+                <w:i w:val="false"/>
+                <w:b w:val="false"/>
+                <w:u w:val="none"/>
+                <w:strike w:val="false"/>
+                <w:sz w:val="22"/>
+                <w:szCs w:val="22"/>
+                <w:color w:val="000000"/>
+              </w:rPr>
+            </w:pPr>
+            <w:r>
+              <w:rPr>
+                <w:rFonts w:ascii="Helvetica" w:hAnsi="Helvetica" w:eastAsia="Helvetica" w:cs="Helvetica"/>
+                <w:i w:val="false"/>
+                <w:b w:val="false"/>
+                <w:u w:val="none"/>
+                <w:strike w:val="false"/>
+                <w:sz w:val="22"/>
+                <w:szCs w:val="22"/>
+                <w:color w:val="000000"/>
+              </w:rPr>
+              <w:t xml:space="preserve">ns</w:t>
             </w:r>
           </w:p>
         </w:tc>
@@ -6587,7 +6587,7 @@
                 <w:szCs w:val="22"/>
                 <w:color w:val="000000"/>
               </w:rPr>
-              <w:t xml:space="preserve">0</w:t>
+              <w:t xml:space="preserve">10.0</w:t>
             </w:r>
           </w:p>
         </w:tc>
@@ -7032,7 +7032,7 @@
                 <w:szCs w:val="22"/>
                 <w:color w:val="000000"/>
               </w:rPr>
-              <w:t xml:space="preserve">0</w:t>
+              <w:t xml:space="preserve">5.0</w:t>
             </w:r>
           </w:p>
         </w:tc>
@@ -7477,117 +7477,117 @@
                 <w:szCs w:val="22"/>
                 <w:color w:val="000000"/>
               </w:rPr>
-              <w:t xml:space="preserve">400</w:t>
-            </w:r>
-          </w:p>
-        </w:tc>
-        <w:tc>
-          <w:tcPr>
-            <w:tcBorders>
-              <w:bottom w:val="none" w:sz="0" w:space="0" w:color="000000"/>
-              <w:top w:val="none" w:sz="0" w:space="0" w:color="000000"/>
-              <w:left w:val="none" w:sz="0" w:space="0" w:color="000000"/>
-              <w:right w:val="none" w:sz="0" w:space="0" w:color="000000"/>
-            </w:tcBorders>
-            <w:shd w:val="clear" w:color="auto" w:fill="FFFFFF"/>
-            <w:tcMar>
-              <w:top w:w="0" w:type="dxa"/>
-              <w:bottom w:w="0" w:type="dxa"/>
-              <w:left w:w="0" w:type="dxa"/>
-              <w:right w:w="0" w:type="dxa"/>
-            </w:tcMar>
-            <w:vAlign w:val="center"/>
-          </w:tcPr>
-          <w:p>
-            <w:pPr>
-              <w:pStyle w:val="Normal"/>
-              <w:jc w:val="left"/>
-              <w:pBdr>
-                <w:bottom w:val="none" w:sz="0" w:space="0" w:color="000000"/>
-                <w:top w:val="none" w:sz="0" w:space="0" w:color="000000"/>
-                <w:left w:val="none" w:sz="0" w:space="0" w:color="000000"/>
-                <w:right w:val="none" w:sz="0" w:space="0" w:color="000000"/>
-              </w:pBdr>
-              <w:spacing w:after="100" w:before="100" w:line="240"/>
-              <w:ind w:left="100" w:right="100" w:firstLine="0" w:firstLineChars="0"/>
-              <w:rPr>
-                <w:rFonts w:ascii="Helvetica" w:hAnsi="Helvetica" w:eastAsia="Helvetica" w:cs="Helvetica"/>
-                <w:i w:val="false"/>
-                <w:b w:val="false"/>
-                <w:u w:val="none"/>
-                <w:strike w:val="false"/>
-                <w:sz w:val="22"/>
-                <w:szCs w:val="22"/>
-                <w:color w:val="000000"/>
-              </w:rPr>
-            </w:pPr>
-            <w:r>
-              <w:rPr>
-                <w:rFonts w:ascii="Helvetica" w:hAnsi="Helvetica" w:eastAsia="Helvetica" w:cs="Helvetica"/>
-                <w:i w:val="false"/>
-                <w:b w:val="false"/>
-                <w:u w:val="none"/>
-                <w:strike w:val="false"/>
-                <w:sz w:val="22"/>
-                <w:szCs w:val="22"/>
-                <w:color w:val="000000"/>
-              </w:rPr>
-              <w:t xml:space="preserve">&lt;0.001</w:t>
-            </w:r>
-          </w:p>
-        </w:tc>
-        <w:tc>
-          <w:tcPr>
-            <w:tcBorders>
-              <w:bottom w:val="none" w:sz="0" w:space="0" w:color="000000"/>
-              <w:top w:val="none" w:sz="0" w:space="0" w:color="000000"/>
-              <w:left w:val="none" w:sz="0" w:space="0" w:color="000000"/>
-              <w:right w:val="none" w:sz="0" w:space="0" w:color="000000"/>
-            </w:tcBorders>
-            <w:shd w:val="clear" w:color="auto" w:fill="FFFFFF"/>
-            <w:tcMar>
-              <w:top w:w="0" w:type="dxa"/>
-              <w:bottom w:w="0" w:type="dxa"/>
-              <w:left w:w="0" w:type="dxa"/>
-              <w:right w:w="0" w:type="dxa"/>
-            </w:tcMar>
-            <w:vAlign w:val="center"/>
-          </w:tcPr>
-          <w:p>
-            <w:pPr>
-              <w:pStyle w:val="Normal"/>
-              <w:jc w:val="left"/>
-              <w:pBdr>
-                <w:bottom w:val="none" w:sz="0" w:space="0" w:color="000000"/>
-                <w:top w:val="none" w:sz="0" w:space="0" w:color="000000"/>
-                <w:left w:val="none" w:sz="0" w:space="0" w:color="000000"/>
-                <w:right w:val="none" w:sz="0" w:space="0" w:color="000000"/>
-              </w:pBdr>
-              <w:spacing w:after="100" w:before="100" w:line="240"/>
-              <w:ind w:left="100" w:right="100" w:firstLine="0" w:firstLineChars="0"/>
-              <w:rPr>
-                <w:rFonts w:ascii="Helvetica" w:hAnsi="Helvetica" w:eastAsia="Helvetica" w:cs="Helvetica"/>
-                <w:i w:val="false"/>
-                <w:b w:val="false"/>
-                <w:u w:val="none"/>
-                <w:strike w:val="false"/>
-                <w:sz w:val="22"/>
-                <w:szCs w:val="22"/>
-                <w:color w:val="000000"/>
-              </w:rPr>
-            </w:pPr>
-            <w:r>
-              <w:rPr>
-                <w:rFonts w:ascii="Helvetica" w:hAnsi="Helvetica" w:eastAsia="Helvetica" w:cs="Helvetica"/>
-                <w:i w:val="false"/>
-                <w:b w:val="false"/>
-                <w:u w:val="none"/>
-                <w:strike w:val="false"/>
-                <w:sz w:val="22"/>
-                <w:szCs w:val="22"/>
-                <w:color w:val="000000"/>
-              </w:rPr>
-              <w:t xml:space="preserve">***</w:t>
+              <w:t xml:space="preserve">488.0</w:t>
+            </w:r>
+          </w:p>
+        </w:tc>
+        <w:tc>
+          <w:tcPr>
+            <w:tcBorders>
+              <w:bottom w:val="none" w:sz="0" w:space="0" w:color="000000"/>
+              <w:top w:val="none" w:sz="0" w:space="0" w:color="000000"/>
+              <w:left w:val="none" w:sz="0" w:space="0" w:color="000000"/>
+              <w:right w:val="none" w:sz="0" w:space="0" w:color="000000"/>
+            </w:tcBorders>
+            <w:shd w:val="clear" w:color="auto" w:fill="FFFFFF"/>
+            <w:tcMar>
+              <w:top w:w="0" w:type="dxa"/>
+              <w:bottom w:w="0" w:type="dxa"/>
+              <w:left w:w="0" w:type="dxa"/>
+              <w:right w:w="0" w:type="dxa"/>
+            </w:tcMar>
+            <w:vAlign w:val="center"/>
+          </w:tcPr>
+          <w:p>
+            <w:pPr>
+              <w:pStyle w:val="Normal"/>
+              <w:jc w:val="left"/>
+              <w:pBdr>
+                <w:bottom w:val="none" w:sz="0" w:space="0" w:color="000000"/>
+                <w:top w:val="none" w:sz="0" w:space="0" w:color="000000"/>
+                <w:left w:val="none" w:sz="0" w:space="0" w:color="000000"/>
+                <w:right w:val="none" w:sz="0" w:space="0" w:color="000000"/>
+              </w:pBdr>
+              <w:spacing w:after="100" w:before="100" w:line="240"/>
+              <w:ind w:left="100" w:right="100" w:firstLine="0" w:firstLineChars="0"/>
+              <w:rPr>
+                <w:rFonts w:ascii="Helvetica" w:hAnsi="Helvetica" w:eastAsia="Helvetica" w:cs="Helvetica"/>
+                <w:i w:val="false"/>
+                <w:b w:val="false"/>
+                <w:u w:val="none"/>
+                <w:strike w:val="false"/>
+                <w:sz w:val="22"/>
+                <w:szCs w:val="22"/>
+                <w:color w:val="000000"/>
+              </w:rPr>
+            </w:pPr>
+            <w:r>
+              <w:rPr>
+                <w:rFonts w:ascii="Helvetica" w:hAnsi="Helvetica" w:eastAsia="Helvetica" w:cs="Helvetica"/>
+                <w:i w:val="false"/>
+                <w:b w:val="false"/>
+                <w:u w:val="none"/>
+                <w:strike w:val="false"/>
+                <w:sz w:val="22"/>
+                <w:szCs w:val="22"/>
+                <w:color w:val="000000"/>
+              </w:rPr>
+              <w:t xml:space="preserve">0.118</w:t>
+            </w:r>
+          </w:p>
+        </w:tc>
+        <w:tc>
+          <w:tcPr>
+            <w:tcBorders>
+              <w:bottom w:val="none" w:sz="0" w:space="0" w:color="000000"/>
+              <w:top w:val="none" w:sz="0" w:space="0" w:color="000000"/>
+              <w:left w:val="none" w:sz="0" w:space="0" w:color="000000"/>
+              <w:right w:val="none" w:sz="0" w:space="0" w:color="000000"/>
+            </w:tcBorders>
+            <w:shd w:val="clear" w:color="auto" w:fill="FFFFFF"/>
+            <w:tcMar>
+              <w:top w:w="0" w:type="dxa"/>
+              <w:bottom w:w="0" w:type="dxa"/>
+              <w:left w:w="0" w:type="dxa"/>
+              <w:right w:w="0" w:type="dxa"/>
+            </w:tcMar>
+            <w:vAlign w:val="center"/>
+          </w:tcPr>
+          <w:p>
+            <w:pPr>
+              <w:pStyle w:val="Normal"/>
+              <w:jc w:val="left"/>
+              <w:pBdr>
+                <w:bottom w:val="none" w:sz="0" w:space="0" w:color="000000"/>
+                <w:top w:val="none" w:sz="0" w:space="0" w:color="000000"/>
+                <w:left w:val="none" w:sz="0" w:space="0" w:color="000000"/>
+                <w:right w:val="none" w:sz="0" w:space="0" w:color="000000"/>
+              </w:pBdr>
+              <w:spacing w:after="100" w:before="100" w:line="240"/>
+              <w:ind w:left="100" w:right="100" w:firstLine="0" w:firstLineChars="0"/>
+              <w:rPr>
+                <w:rFonts w:ascii="Helvetica" w:hAnsi="Helvetica" w:eastAsia="Helvetica" w:cs="Helvetica"/>
+                <w:i w:val="false"/>
+                <w:b w:val="false"/>
+                <w:u w:val="none"/>
+                <w:strike w:val="false"/>
+                <w:sz w:val="22"/>
+                <w:szCs w:val="22"/>
+                <w:color w:val="000000"/>
+              </w:rPr>
+            </w:pPr>
+            <w:r>
+              <w:rPr>
+                <w:rFonts w:ascii="Helvetica" w:hAnsi="Helvetica" w:eastAsia="Helvetica" w:cs="Helvetica"/>
+                <w:i w:val="false"/>
+                <w:b w:val="false"/>
+                <w:u w:val="none"/>
+                <w:strike w:val="false"/>
+                <w:sz w:val="22"/>
+                <w:szCs w:val="22"/>
+                <w:color w:val="000000"/>
+              </w:rPr>
+              <w:t xml:space="preserve">ns</w:t>
             </w:r>
           </w:p>
         </w:tc>
@@ -7922,7 +7922,7 @@
                 <w:szCs w:val="22"/>
                 <w:color w:val="000000"/>
               </w:rPr>
-              <w:t xml:space="preserve">0</w:t>
+              <w:t xml:space="preserve">4.0</w:t>
             </w:r>
           </w:p>
         </w:tc>
@@ -8367,7 +8367,7 @@
                 <w:szCs w:val="22"/>
                 <w:color w:val="000000"/>
               </w:rPr>
-              <w:t xml:space="preserve">0</w:t>
+              <w:t xml:space="preserve">3.0</w:t>
             </w:r>
           </w:p>
         </w:tc>
@@ -8812,7 +8812,7 @@
                 <w:szCs w:val="22"/>
                 <w:color w:val="000000"/>
               </w:rPr>
-              <w:t xml:space="preserve">406</w:t>
+              <w:t xml:space="preserve">774.0</w:t>
             </w:r>
           </w:p>
         </w:tc>
@@ -9257,7 +9257,7 @@
                 <w:szCs w:val="22"/>
                 <w:color w:val="000000"/>
               </w:rPr>
-              <w:t xml:space="preserve">0</w:t>
+              <w:t xml:space="preserve">13.0</w:t>
             </w:r>
           </w:p>
         </w:tc>
@@ -9702,7 +9702,7 @@
                 <w:szCs w:val="22"/>
                 <w:color w:val="000000"/>
               </w:rPr>
-              <w:t xml:space="preserve">0</w:t>
+              <w:t xml:space="preserve">0.0</w:t>
             </w:r>
           </w:p>
         </w:tc>
@@ -10147,7 +10147,7 @@
                 <w:szCs w:val="22"/>
                 <w:color w:val="000000"/>
               </w:rPr>
-              <w:t xml:space="preserve">406</w:t>
+              <w:t xml:space="preserve">777.0</w:t>
             </w:r>
           </w:p>
         </w:tc>
@@ -10592,7 +10592,7 @@
                 <w:szCs w:val="22"/>
                 <w:color w:val="000000"/>
               </w:rPr>
-              <w:t xml:space="preserve">0</w:t>
+              <w:t xml:space="preserve">5.0</w:t>
             </w:r>
           </w:p>
         </w:tc>
@@ -11037,7 +11037,7 @@
                 <w:szCs w:val="22"/>
                 <w:color w:val="000000"/>
               </w:rPr>
-              <w:t xml:space="preserve">0</w:t>
+              <w:t xml:space="preserve">0.0</w:t>
             </w:r>
           </w:p>
         </w:tc>
@@ -11482,7 +11482,7 @@
                 <w:szCs w:val="22"/>
                 <w:color w:val="000000"/>
               </w:rPr>
-              <w:t xml:space="preserve">406</w:t>
+              <w:t xml:space="preserve">770.5</w:t>
             </w:r>
           </w:p>
         </w:tc>
@@ -11927,7 +11927,7 @@
                 <w:szCs w:val="22"/>
                 <w:color w:val="000000"/>
               </w:rPr>
-              <w:t xml:space="preserve">0</w:t>
+              <w:t xml:space="preserve">2.5</w:t>
             </w:r>
           </w:p>
         </w:tc>
@@ -12372,7 +12372,7 @@
                 <w:szCs w:val="22"/>
                 <w:color w:val="000000"/>
               </w:rPr>
-              <w:t xml:space="preserve">0</w:t>
+              <w:t xml:space="preserve">0.0</w:t>
             </w:r>
           </w:p>
         </w:tc>

</xml_diff>